<commit_message>
Documentation for the single-package design (spec 4.0, guides, diagram)
Specification rewritten for one package per CMS with the server inside;
WordPress and Joomla installation guides, user guide and deployment
diagram redone with bundled-flow screenshots. Narrow list view fix in
the showcase CSS.

Co-Authored-By: Claude Fable 5.1 <noreply@anthropic.com>
Claude-Session: https://claude.ai/code/session_01GjP4aQvPNC5gK9soytUbnv
</commit_message>
<xml_diff>
--- a/docs/MediaMarketplace-Studio-User-Guide.docx
+++ b/docs/MediaMarketplace-Studio-User-Guide.docx
@@ -30,7 +30,7 @@
         <w:t xml:space="preserve">Applies to:</w:t>
       </w:r>
       <w:r>
-        <w:t xml:space="preserve"> mms-server 0.1.0 with the WordPress and Joomla bridge plugins 0.1.0</w:t>
+        <w:t xml:space="preserve"> MediaMarketplace Studio 0.2.0 for WordPress and for Joomla</w:t>
       </w:r>
     </w:p>
     <w:p>
@@ -60,7 +60,7 @@
         <w:t xml:space="preserve">Screens:</w:t>
       </w:r>
       <w:r>
-        <w:t xml:space="preserve"> server screens are live captures; WordPress and Joomla screens are mock-ups drawn to match the real screens</w:t>
+        <w:t xml:space="preserve"> store screens are live captures; WordPress and Joomla admin screens are mock-ups drawn to match the real screens</w:t>
       </w:r>
     </w:p>
     <w:p>
@@ -105,7 +105,7 @@
           <w:sz w:val="21"/>
           <w:szCs w:val="21"/>
         </w:rPr>
-        <w:t xml:space="preserve">2. Signing in</w:t>
+        <w:t xml:space="preserve">2. Opening the store admin</w:t>
       </w:r>
     </w:p>
     <w:p>
@@ -135,7 +135,7 @@
           <w:sz w:val="21"/>
           <w:szCs w:val="21"/>
         </w:rPr>
-        <w:t xml:space="preserve">4. Connected websites (Bridges)</w:t>
+        <w:t xml:space="preserve">4. Server status</w:t>
       </w:r>
     </w:p>
     <w:p>
@@ -150,7 +150,7 @@
           <w:sz w:val="21"/>
           <w:szCs w:val="21"/>
         </w:rPr>
-        <w:t xml:space="preserve">5. Settings</w:t>
+        <w:t xml:space="preserve">5. Connected site (Bridges)</w:t>
       </w:r>
     </w:p>
     <w:p>
@@ -165,7 +165,7 @@
           <w:sz w:val="21"/>
           <w:szCs w:val="21"/>
         </w:rPr>
-        <w:t xml:space="preserve">6. Health</w:t>
+        <w:t xml:space="preserve">6. Settings</w:t>
       </w:r>
     </w:p>
     <w:p>
@@ -180,7 +180,7 @@
           <w:sz w:val="21"/>
           <w:szCs w:val="21"/>
         </w:rPr>
-        <w:t xml:space="preserve">7. The store on your website</w:t>
+        <w:t xml:space="preserve">7. Health</w:t>
       </w:r>
     </w:p>
     <w:p>
@@ -195,7 +195,7 @@
           <w:sz w:val="21"/>
           <w:szCs w:val="21"/>
         </w:rPr>
-        <w:t xml:space="preserve">8. Member sign-on</w:t>
+        <w:t xml:space="preserve">8. The store on your website</w:t>
       </w:r>
     </w:p>
     <w:p>
@@ -210,7 +210,7 @@
           <w:sz w:val="21"/>
           <w:szCs w:val="21"/>
         </w:rPr>
-        <w:t xml:space="preserve">9. Products (preview of the next release)</w:t>
+        <w:t xml:space="preserve">9. Member sign-in</w:t>
       </w:r>
     </w:p>
     <w:p>
@@ -225,7 +225,7 @@
           <w:sz w:val="21"/>
           <w:szCs w:val="21"/>
         </w:rPr>
-        <w:t xml:space="preserve">10. Roadmap</w:t>
+        <w:t xml:space="preserve">10. Products (preview of the next release)</w:t>
       </w:r>
     </w:p>
     <w:p>
@@ -240,7 +240,37 @@
           <w:sz w:val="21"/>
           <w:szCs w:val="21"/>
         </w:rPr>
-        <w:t xml:space="preserve">11. Glossary</w:t>
+        <w:t xml:space="preserve">11. Backups and data</w:t>
+      </w:r>
+    </w:p>
+    <w:p>
+      <w:pPr>
+        <w:spacing w:after="30"/>
+        <w:ind w:left="0"/>
+      </w:pPr>
+      <w:r>
+        <w:rPr>
+          <w:b/>
+          <w:bCs/>
+          <w:sz w:val="21"/>
+          <w:szCs w:val="21"/>
+        </w:rPr>
+        <w:t xml:space="preserve">12. Roadmap</w:t>
+      </w:r>
+    </w:p>
+    <w:p>
+      <w:pPr>
+        <w:spacing w:after="30"/>
+        <w:ind w:left="0"/>
+      </w:pPr>
+      <w:r>
+        <w:rPr>
+          <w:b/>
+          <w:bCs/>
+          <w:sz w:val="21"/>
+          <w:szCs w:val="21"/>
+        </w:rPr>
+        <w:t xml:space="preserve">13. Glossary</w:t>
       </w:r>
     </w:p>
     <w:p>
@@ -259,7 +289,37 @@
         <w:spacing w:after="120" w:line="276"/>
       </w:pPr>
       <w:r>
-        <w:t xml:space="preserve">MediaMarketplace Studio has two parts.</w:t>
+        <w:t xml:space="preserve">MediaMarketplace Studio installs into your WordPress or Joomla site as one package and runs entirely on that site's server. Inside the package is the marketplace server, a small program that your site starts and keeps running in the background. It holds everything about the store: media, products, prices, customers, orders, access rights and protection settings.</w:t>
+      </w:r>
+    </w:p>
+    <w:p>
+      <w:pPr>
+        <w:spacing w:after="120" w:line="276"/>
+      </w:pPr>
+      <w:r>
+        <w:t xml:space="preserve">You never see that program directly. You manage the store in a web admin that opens from your CMS menu at your site's own address followed by </w:t>
+      </w:r>
+      <w:r>
+        <w:rPr>
+          <w:rFonts w:ascii="Consolas" w:cs="Consolas" w:eastAsia="Consolas" w:hAnsi="Consolas"/>
+          <w:sz w:val="19"/>
+          <w:szCs w:val="19"/>
+        </w:rPr>
+        <w:t xml:space="preserve">/mms/admin</w:t>
+      </w:r>
+      <w:r>
+        <w:t xml:space="preserve">, and visitors see the store inside your normal pages.</w:t>
+      </w:r>
+    </w:p>
+    <w:p>
+      <w:pPr>
+        <w:pStyle w:val="Heading1"/>
+        <w:keepNext/>
+        <w:pageBreakBefore/>
+        <w:spacing w:after="120" w:before="360"/>
+      </w:pPr>
+      <w:r>
+        <w:t xml:space="preserve">2. Opening the store admin</w:t>
       </w:r>
     </w:p>
     <w:p>
@@ -276,21 +336,20 @@
           <w:b/>
           <w:bCs/>
         </w:rPr>
-        <w:t xml:space="preserve">The server</w:t>
-      </w:r>
-      <w:r>
-        <w:t xml:space="preserve"> runs on your own machine and holds everything: the media library, products, prices, customers, orders, access rights, protection settings. You manage it in a web admin at </w:t>
-      </w:r>
-      <w:r>
-        <w:rPr>
-          <w:rFonts w:ascii="Consolas" w:cs="Consolas" w:eastAsia="Consolas" w:hAnsi="Consolas"/>
-          <w:sz w:val="19"/>
-          <w:szCs w:val="19"/>
-        </w:rPr>
-        <w:t xml:space="preserve">https://your-server/admin</w:t>
-      </w:r>
-      <w:r>
-        <w:t xml:space="preserve">.</w:t>
+        <w:t xml:space="preserve">WordPress</w:t>
+      </w:r>
+      <w:r>
+        <w:t xml:space="preserve">: click </w:t>
+      </w:r>
+      <w:r>
+        <w:rPr>
+          <w:b/>
+          <w:bCs/>
+        </w:rPr>
+        <w:t xml:space="preserve">MediaMarketplace</w:t>
+      </w:r>
+      <w:r>
+        <w:t xml:space="preserve"> in the admin menu.</w:t>
       </w:r>
     </w:p>
     <w:p>
@@ -307,10 +366,20 @@
           <w:b/>
           <w:bCs/>
         </w:rPr>
-        <w:t xml:space="preserve">The bridges</w:t>
-      </w:r>
-      <w:r>
-        <w:t xml:space="preserve"> are small plugins for WordPress and Joomla. They show the server's store inside your website's pages and let your website's members sign in to the server with one click. They hold no store data of their own.</w:t>
+        <w:t xml:space="preserve">Joomla</w:t>
+      </w:r>
+      <w:r>
+        <w:t xml:space="preserve">: click </w:t>
+      </w:r>
+      <w:r>
+        <w:rPr>
+          <w:b/>
+          <w:bCs/>
+        </w:rPr>
+        <w:t xml:space="preserve">Components → MediaMarketplace → Open store admin</w:t>
+      </w:r>
+      <w:r>
+        <w:t xml:space="preserve">.</w:t>
       </w:r>
     </w:p>
     <w:p>
@@ -318,26 +387,7 @@
         <w:spacing w:after="120" w:line="276"/>
       </w:pPr>
       <w:r>
-        <w:t xml:space="preserve">A visitor sees your normal website. The store area inside a page is delivered by the server, so a change made in the server admin appears on every connected site at once.</w:t>
-      </w:r>
-    </w:p>
-    <w:p>
-      <w:pPr>
-        <w:pStyle w:val="Heading1"/>
-        <w:keepNext/>
-        <w:pageBreakBefore/>
-        <w:spacing w:after="120" w:before="360"/>
-      </w:pPr>
-      <w:r>
-        <w:t xml:space="preserve">2. Signing in</w:t>
-      </w:r>
-    </w:p>
-    <w:p>
-      <w:pPr>
-        <w:spacing w:after="120" w:line="276"/>
-      </w:pPr>
-      <w:r>
-        <w:t xml:space="preserve">Open </w:t>
+        <w:t xml:space="preserve">You are signed in as a store administrator with the account you are already using. Members of your site are recognised the same way when they follow a "My media" link. There is also a direct sign-in page at </w:t>
       </w:r>
       <w:r>
         <w:rPr>
@@ -345,10 +395,10 @@
           <w:sz w:val="19"/>
           <w:szCs w:val="19"/>
         </w:rPr>
-        <w:t xml:space="preserve">https://your-server/admin</w:t>
-      </w:r>
-      <w:r>
-        <w:t xml:space="preserve">. On the very first visit you see the setup wizard, which creates the first administrator. After that, the sign-in page appears.</w:t>
+        <w:t xml:space="preserve">/mms/admin/login</w:t>
+      </w:r>
+      <w:r>
+        <w:t xml:space="preserve"> for store-only accounts.</w:t>
       </w:r>
     </w:p>
     <w:p>
@@ -417,7 +467,7 @@
           <w:sz w:val="18"/>
           <w:szCs w:val="18"/>
         </w:rPr>
-        <w:t xml:space="preserve">Sign in with the administrator email and password</w:t>
+        <w:t xml:space="preserve">The store sign-in page, for store-only administrator accounts</w:t>
       </w:r>
     </w:p>
     <w:p>
@@ -425,7 +475,7 @@
         <w:spacing w:after="120" w:line="276"/>
       </w:pPr>
       <w:r>
-        <w:t xml:space="preserve">Sessions last twelve hours by default. </w:t>
+        <w:t xml:space="preserve">Sessions last twelve hours. </w:t>
       </w:r>
       <w:r>
         <w:rPr>
@@ -435,18 +485,7 @@
         <w:t xml:space="preserve">Sign out</w:t>
       </w:r>
       <w:r>
-        <w:t xml:space="preserve"> is at the right end of the top bar. If you forget the password, an administrator with shell access can create another administrator with the </w:t>
-      </w:r>
-      <w:r>
-        <w:rPr>
-          <w:rFonts w:ascii="Consolas" w:cs="Consolas" w:eastAsia="Consolas" w:hAnsi="Consolas"/>
-          <w:sz w:val="19"/>
-          <w:szCs w:val="19"/>
-        </w:rPr>
-        <w:t xml:space="preserve">mms-server admin</w:t>
-      </w:r>
-      <w:r>
-        <w:t xml:space="preserve"> command.</w:t>
+        <w:t xml:space="preserve"> is at the right end of the top bar.</w:t>
       </w:r>
     </w:p>
     <w:p>
@@ -465,7 +504,7 @@
         <w:spacing w:after="120" w:line="276"/>
       </w:pPr>
       <w:r>
-        <w:t xml:space="preserve">The dashboard shows counts of products, media items, customers and connected sites, a list of recent activity from the audit log, and the next steps for a new install.</w:t>
+        <w:t xml:space="preserve">The dashboard shows counts of products, media items, customers and connected sites, a list of recent activity, and the next steps for a new install.</w:t>
       </w:r>
     </w:p>
     <w:p>
@@ -534,7 +573,7 @@
           <w:sz w:val="18"/>
           <w:szCs w:val="18"/>
         </w:rPr>
-        <w:t xml:space="preserve">The dashboard with a few products and two connected sites</w:t>
+        <w:t xml:space="preserve">The dashboard</w:t>
       </w:r>
     </w:p>
     <w:p>
@@ -542,7 +581,7 @@
         <w:spacing w:after="120" w:line="276"/>
       </w:pPr>
       <w:r>
-        <w:t xml:space="preserve">Recent activity records who did what and when: sign-ins, settings changes, bridge sites created or removed, access grants and revocations.</w:t>
+        <w:t xml:space="preserve">Recent activity records who did what and when: sign-ins, settings changes, access grants and revocations, and administrator promotions from the CMS.</w:t>
       </w:r>
     </w:p>
     <w:p>
@@ -553,22 +592,75 @@
         <w:spacing w:after="120" w:before="360"/>
       </w:pPr>
       <w:r>
-        <w:t xml:space="preserve">4. Connected websites (Bridges)</w:t>
+        <w:t xml:space="preserve">4. Server status</w:t>
       </w:r>
     </w:p>
     <w:p>
       <w:pPr>
         <w:spacing w:after="120" w:line="276"/>
+      </w:pPr>
+      <w:r>
+        <w:t xml:space="preserve">Each CMS has a status page for the background server:</w:t>
+      </w:r>
+    </w:p>
+    <w:p>
+      <w:pPr>
+        <w:pStyle w:val="ListParagraph"/>
+        <w:numPr>
+          <w:ilvl w:val="0"/>
+          <w:numId w:val="2"/>
+        </w:numPr>
+        <w:spacing w:after="60" w:line="276"/>
       </w:pPr>
       <w:r>
         <w:rPr>
           <w:b/>
           <w:bCs/>
         </w:rPr>
-        <w:t xml:space="preserve">Bridges</w:t>
-      </w:r>
-      <w:r>
-        <w:t xml:space="preserve"> lists every WordPress or Joomla site allowed to show your store and sign visitors in.</w:t>
+        <w:t xml:space="preserve">WordPress</w:t>
+      </w:r>
+      <w:r>
+        <w:t xml:space="preserve">: </w:t>
+      </w:r>
+      <w:r>
+        <w:rPr>
+          <w:b/>
+          <w:bCs/>
+        </w:rPr>
+        <w:t xml:space="preserve">MediaMarketplace → Status</w:t>
+      </w:r>
+      <w:r>
+        <w:t xml:space="preserve">.</w:t>
+      </w:r>
+    </w:p>
+    <w:p>
+      <w:pPr>
+        <w:pStyle w:val="ListParagraph"/>
+        <w:numPr>
+          <w:ilvl w:val="0"/>
+          <w:numId w:val="2"/>
+        </w:numPr>
+        <w:spacing w:after="60" w:line="276"/>
+      </w:pPr>
+      <w:r>
+        <w:rPr>
+          <w:b/>
+          <w:bCs/>
+        </w:rPr>
+        <w:t xml:space="preserve">Joomla</w:t>
+      </w:r>
+      <w:r>
+        <w:t xml:space="preserve">: </w:t>
+      </w:r>
+      <w:r>
+        <w:rPr>
+          <w:b/>
+          <w:bCs/>
+        </w:rPr>
+        <w:t xml:space="preserve">Components → MediaMarketplace → Server status</w:t>
+      </w:r>
+      <w:r>
+        <w:t xml:space="preserve">.</w:t>
       </w:r>
     </w:p>
     <w:p>
@@ -637,98 +729,7 @@
           <w:sz w:val="18"/>
           <w:szCs w:val="18"/>
         </w:rPr>
-        <w:t xml:space="preserve">The Bridges page listing two connected sites</w:t>
-      </w:r>
-    </w:p>
-    <w:p>
-      <w:pPr>
-        <w:spacing w:after="120" w:line="276"/>
-      </w:pPr>
-      <w:r>
-        <w:rPr>
-          <w:b/>
-          <w:bCs/>
-        </w:rPr>
-        <w:t xml:space="preserve">Adding a site.</w:t>
-      </w:r>
-      <w:r>
-        <w:t xml:space="preserve"> Enter a name, choose the host type, and enter the site's origin (scheme and host only). The server generates a secret and shows it once, together with the site ID and server URL. Copy the three values into the bridge plugin on that site.</w:t>
-      </w:r>
-    </w:p>
-    <w:p>
-      <w:pPr>
-        <w:spacing w:after="120" w:line="276"/>
-      </w:pPr>
-      <w:r>
-        <w:rPr>
-          <w:b/>
-          <w:bCs/>
-        </w:rPr>
-        <w:t xml:space="preserve">Why the origin matters.</w:t>
-      </w:r>
-      <w:r>
-        <w:t xml:space="preserve"> The server only allows its store pages to be framed by the origin you enter. A copy of your embed code on another domain will not work.</w:t>
-      </w:r>
-    </w:p>
-    <w:p>
-      <w:pPr>
-        <w:spacing w:after="120" w:line="276"/>
-      </w:pPr>
-      <w:r>
-        <w:rPr>
-          <w:b/>
-          <w:bCs/>
-        </w:rPr>
-        <w:t xml:space="preserve">Removing a site.</w:t>
-      </w:r>
-      <w:r>
-        <w:t xml:space="preserve"> Click </w:t>
-      </w:r>
-      <w:r>
-        <w:rPr>
-          <w:b/>
-          <w:bCs/>
-        </w:rPr>
-        <w:t xml:space="preserve">Remove</w:t>
-      </w:r>
-      <w:r>
-        <w:t xml:space="preserve">. Embeds and sign-on from that site stop immediately. The customers who signed in from it keep their accounts and purchases.</w:t>
-      </w:r>
-    </w:p>
-    <w:p>
-      <w:pPr>
-        <w:pStyle w:val="Heading1"/>
-        <w:keepNext/>
-        <w:pageBreakBefore/>
-        <w:spacing w:after="120" w:before="360"/>
-      </w:pPr>
-      <w:r>
-        <w:t xml:space="preserve">5. Settings</w:t>
-      </w:r>
-    </w:p>
-    <w:p>
-      <w:pPr>
-        <w:spacing w:after="120" w:line="276"/>
-      </w:pPr>
-      <w:r>
-        <w:rPr>
-          <w:b/>
-          <w:bCs/>
-        </w:rPr>
-        <w:t xml:space="preserve">Settings</w:t>
-      </w:r>
-      <w:r>
-        <w:t xml:space="preserve"> groups every runtime option. Change values and click </w:t>
-      </w:r>
-      <w:r>
-        <w:rPr>
-          <w:b/>
-          <w:bCs/>
-        </w:rPr>
-        <w:t xml:space="preserve">Save settings</w:t>
-      </w:r>
-      <w:r>
-        <w:t xml:space="preserve">. Invalid values are refused with a message and nothing is saved.</w:t>
+        <w:t xml:space="preserve">The WordPress status page (mock-up)</w:t>
       </w:r>
     </w:p>
     <w:p>
@@ -797,557 +798,15 @@
           <w:sz w:val="18"/>
           <w:szCs w:val="18"/>
         </w:rPr>
-        <w:t xml:space="preserve">The settings page</w:t>
-      </w:r>
-    </w:p>
-    <w:tbl>
-      <w:tblPr>
-        <w:tblW w:type="dxa" w:w="9360"/>
-        <w:tblBorders>
-          <w:top w:val="single" w:color="auto" w:sz="4"/>
-          <w:left w:val="single" w:color="auto" w:sz="4"/>
-          <w:bottom w:val="single" w:color="auto" w:sz="4"/>
-          <w:right w:val="single" w:color="auto" w:sz="4"/>
-          <w:insideH w:val="single" w:color="auto" w:sz="4"/>
-          <w:insideV w:val="single" w:color="auto" w:sz="4"/>
-        </w:tblBorders>
-      </w:tblPr>
-      <w:tblGrid>
-        <w:gridCol w:w="1771"/>
-        <w:gridCol w:w="7589"/>
-      </w:tblGrid>
-      <w:tr>
-        <w:trPr>
-          <w:cantSplit/>
-          <w:tblHeader/>
-        </w:trPr>
-        <w:tc>
-          <w:tcPr>
-            <w:tcW w:type="dxa" w:w="1771"/>
-            <w:tcBorders>
-              <w:top w:val="single" w:color="BFC7D1" w:sz="4"/>
-              <w:left w:val="single" w:color="BFC7D1" w:sz="4"/>
-              <w:bottom w:val="single" w:color="BFC7D1" w:sz="4"/>
-              <w:right w:val="single" w:color="BFC7D1" w:sz="4"/>
-            </w:tcBorders>
-            <w:shd w:fill="1F3A5F" w:color="auto" w:val="clear"/>
-            <w:tcMar>
-              <w:top w:type="dxa" w:w="60"/>
-              <w:left w:type="dxa" w:w="90"/>
-              <w:bottom w:type="dxa" w:w="60"/>
-              <w:right w:type="dxa" w:w="90"/>
-            </w:tcMar>
-          </w:tcPr>
-          <w:p>
-            <w:pPr>
-              <w:spacing w:after="0" w:line="252"/>
-            </w:pPr>
-            <w:r>
-              <w:rPr>
-                <w:b/>
-                <w:bCs/>
-                <w:color w:val="FFFFFF"/>
-                <w:sz w:val="18"/>
-                <w:szCs w:val="18"/>
-              </w:rPr>
-              <w:t xml:space="preserve">Section</w:t>
-            </w:r>
-          </w:p>
-        </w:tc>
-        <w:tc>
-          <w:tcPr>
-            <w:tcW w:type="dxa" w:w="7589"/>
-            <w:tcBorders>
-              <w:top w:val="single" w:color="BFC7D1" w:sz="4"/>
-              <w:left w:val="single" w:color="BFC7D1" w:sz="4"/>
-              <w:bottom w:val="single" w:color="BFC7D1" w:sz="4"/>
-              <w:right w:val="single" w:color="BFC7D1" w:sz="4"/>
-            </w:tcBorders>
-            <w:shd w:fill="1F3A5F" w:color="auto" w:val="clear"/>
-            <w:tcMar>
-              <w:top w:type="dxa" w:w="60"/>
-              <w:left w:type="dxa" w:w="90"/>
-              <w:bottom w:type="dxa" w:w="60"/>
-              <w:right w:type="dxa" w:w="90"/>
-            </w:tcMar>
-          </w:tcPr>
-          <w:p>
-            <w:pPr>
-              <w:spacing w:after="0" w:line="252"/>
-            </w:pPr>
-            <w:r>
-              <w:rPr>
-                <w:b/>
-                <w:bCs/>
-                <w:color w:val="FFFFFF"/>
-                <w:sz w:val="18"/>
-                <w:szCs w:val="18"/>
-              </w:rPr>
-              <w:t xml:space="preserve">Settings</w:t>
-            </w:r>
-          </w:p>
-        </w:tc>
-      </w:tr>
-      <w:tr>
-        <w:trPr>
-          <w:cantSplit/>
-          <w:tblHeader w:val="false"/>
-        </w:trPr>
-        <w:tc>
-          <w:tcPr>
-            <w:tcW w:type="dxa" w:w="1771"/>
-            <w:tcBorders>
-              <w:top w:val="single" w:color="BFC7D1" w:sz="4"/>
-              <w:left w:val="single" w:color="BFC7D1" w:sz="4"/>
-              <w:bottom w:val="single" w:color="BFC7D1" w:sz="4"/>
-              <w:right w:val="single" w:color="BFC7D1" w:sz="4"/>
-            </w:tcBorders>
-            <w:tcMar>
-              <w:top w:type="dxa" w:w="60"/>
-              <w:left w:type="dxa" w:w="90"/>
-              <w:bottom w:type="dxa" w:w="60"/>
-              <w:right w:type="dxa" w:w="90"/>
-            </w:tcMar>
-          </w:tcPr>
-          <w:p>
-            <w:pPr>
-              <w:spacing w:after="0" w:line="252"/>
-            </w:pPr>
-            <w:r>
-              <w:rPr>
-                <w:sz w:val="18"/>
-                <w:szCs w:val="18"/>
-              </w:rPr>
-              <w:t xml:space="preserve">General</w:t>
-            </w:r>
-          </w:p>
-        </w:tc>
-        <w:tc>
-          <w:tcPr>
-            <w:tcW w:type="dxa" w:w="7589"/>
-            <w:tcBorders>
-              <w:top w:val="single" w:color="BFC7D1" w:sz="4"/>
-              <w:left w:val="single" w:color="BFC7D1" w:sz="4"/>
-              <w:bottom w:val="single" w:color="BFC7D1" w:sz="4"/>
-              <w:right w:val="single" w:color="BFC7D1" w:sz="4"/>
-            </w:tcBorders>
-            <w:tcMar>
-              <w:top w:type="dxa" w:w="60"/>
-              <w:left w:type="dxa" w:w="90"/>
-              <w:bottom w:type="dxa" w:w="60"/>
-              <w:right w:type="dxa" w:w="90"/>
-            </w:tcMar>
-          </w:tcPr>
-          <w:p>
-            <w:pPr>
-              <w:spacing w:after="0" w:line="252"/>
-            </w:pPr>
-            <w:r>
-              <w:rPr>
-                <w:sz w:val="18"/>
-                <w:szCs w:val="18"/>
-              </w:rPr>
-              <w:t xml:space="preserve">store name (shown in embeds, emails and receipts), log level</w:t>
-            </w:r>
-          </w:p>
-        </w:tc>
-      </w:tr>
-      <w:tr>
-        <w:trPr>
-          <w:cantSplit/>
-          <w:tblHeader w:val="false"/>
-        </w:trPr>
-        <w:tc>
-          <w:tcPr>
-            <w:tcW w:type="dxa" w:w="1771"/>
-            <w:tcBorders>
-              <w:top w:val="single" w:color="BFC7D1" w:sz="4"/>
-              <w:left w:val="single" w:color="BFC7D1" w:sz="4"/>
-              <w:bottom w:val="single" w:color="BFC7D1" w:sz="4"/>
-              <w:right w:val="single" w:color="BFC7D1" w:sz="4"/>
-            </w:tcBorders>
-            <w:tcMar>
-              <w:top w:type="dxa" w:w="60"/>
-              <w:left w:type="dxa" w:w="90"/>
-              <w:bottom w:type="dxa" w:w="60"/>
-              <w:right w:type="dxa" w:w="90"/>
-            </w:tcMar>
-          </w:tcPr>
-          <w:p>
-            <w:pPr>
-              <w:spacing w:after="0" w:line="252"/>
-            </w:pPr>
-            <w:r>
-              <w:rPr>
-                <w:sz w:val="18"/>
-                <w:szCs w:val="18"/>
-              </w:rPr>
-              <w:t xml:space="preserve">Store</w:t>
-            </w:r>
-          </w:p>
-        </w:tc>
-        <w:tc>
-          <w:tcPr>
-            <w:tcW w:type="dxa" w:w="7589"/>
-            <w:tcBorders>
-              <w:top w:val="single" w:color="BFC7D1" w:sz="4"/>
-              <w:left w:val="single" w:color="BFC7D1" w:sz="4"/>
-              <w:bottom w:val="single" w:color="BFC7D1" w:sz="4"/>
-              <w:right w:val="single" w:color="BFC7D1" w:sz="4"/>
-            </w:tcBorders>
-            <w:tcMar>
-              <w:top w:type="dxa" w:w="60"/>
-              <w:left w:type="dxa" w:w="90"/>
-              <w:bottom w:type="dxa" w:w="60"/>
-              <w:right w:type="dxa" w:w="90"/>
-            </w:tcMar>
-          </w:tcPr>
-          <w:p>
-            <w:pPr>
-              <w:spacing w:after="0" w:line="252"/>
-            </w:pPr>
-            <w:r>
-              <w:rPr>
-                <w:sz w:val="18"/>
-                <w:szCs w:val="18"/>
-              </w:rPr>
-              <w:t xml:space="preserve">base currency, receipt number prefix</w:t>
-            </w:r>
-          </w:p>
-        </w:tc>
-      </w:tr>
-      <w:tr>
-        <w:trPr>
-          <w:cantSplit/>
-          <w:tblHeader w:val="false"/>
-        </w:trPr>
-        <w:tc>
-          <w:tcPr>
-            <w:tcW w:type="dxa" w:w="1771"/>
-            <w:tcBorders>
-              <w:top w:val="single" w:color="BFC7D1" w:sz="4"/>
-              <w:left w:val="single" w:color="BFC7D1" w:sz="4"/>
-              <w:bottom w:val="single" w:color="BFC7D1" w:sz="4"/>
-              <w:right w:val="single" w:color="BFC7D1" w:sz="4"/>
-            </w:tcBorders>
-            <w:tcMar>
-              <w:top w:type="dxa" w:w="60"/>
-              <w:left w:type="dxa" w:w="90"/>
-              <w:bottom w:type="dxa" w:w="60"/>
-              <w:right w:type="dxa" w:w="90"/>
-            </w:tcMar>
-          </w:tcPr>
-          <w:p>
-            <w:pPr>
-              <w:spacing w:after="0" w:line="252"/>
-            </w:pPr>
-            <w:r>
-              <w:rPr>
-                <w:sz w:val="18"/>
-                <w:szCs w:val="18"/>
-              </w:rPr>
-              <w:t xml:space="preserve">Media</w:t>
-            </w:r>
-          </w:p>
-        </w:tc>
-        <w:tc>
-          <w:tcPr>
-            <w:tcW w:type="dxa" w:w="7589"/>
-            <w:tcBorders>
-              <w:top w:val="single" w:color="BFC7D1" w:sz="4"/>
-              <w:left w:val="single" w:color="BFC7D1" w:sz="4"/>
-              <w:bottom w:val="single" w:color="BFC7D1" w:sz="4"/>
-              <w:right w:val="single" w:color="BFC7D1" w:sz="4"/>
-            </w:tcBorders>
-            <w:tcMar>
-              <w:top w:type="dxa" w:w="60"/>
-              <w:left w:type="dxa" w:w="90"/>
-              <w:bottom w:type="dxa" w:w="60"/>
-              <w:right w:type="dxa" w:w="90"/>
-            </w:tcMar>
-          </w:tcPr>
-          <w:p>
-            <w:pPr>
-              <w:spacing w:after="0" w:line="252"/>
-            </w:pPr>
-            <w:r>
-              <w:rPr>
-                <w:sz w:val="18"/>
-                <w:szCs w:val="18"/>
-              </w:rPr>
-              <w:t xml:space="preserve">maximum upload size, path to ffmpeg</w:t>
-            </w:r>
-          </w:p>
-        </w:tc>
-      </w:tr>
-      <w:tr>
-        <w:trPr>
-          <w:cantSplit/>
-          <w:tblHeader w:val="false"/>
-        </w:trPr>
-        <w:tc>
-          <w:tcPr>
-            <w:tcW w:type="dxa" w:w="1771"/>
-            <w:tcBorders>
-              <w:top w:val="single" w:color="BFC7D1" w:sz="4"/>
-              <w:left w:val="single" w:color="BFC7D1" w:sz="4"/>
-              <w:bottom w:val="single" w:color="BFC7D1" w:sz="4"/>
-              <w:right w:val="single" w:color="BFC7D1" w:sz="4"/>
-            </w:tcBorders>
-            <w:tcMar>
-              <w:top w:type="dxa" w:w="60"/>
-              <w:left w:type="dxa" w:w="90"/>
-              <w:bottom w:type="dxa" w:w="60"/>
-              <w:right w:type="dxa" w:w="90"/>
-            </w:tcMar>
-          </w:tcPr>
-          <w:p>
-            <w:pPr>
-              <w:spacing w:after="0" w:line="252"/>
-            </w:pPr>
-            <w:r>
-              <w:rPr>
-                <w:sz w:val="18"/>
-                <w:szCs w:val="18"/>
-              </w:rPr>
-              <w:t xml:space="preserve">Players</w:t>
-            </w:r>
-          </w:p>
-        </w:tc>
-        <w:tc>
-          <w:tcPr>
-            <w:tcW w:type="dxa" w:w="7589"/>
-            <w:tcBorders>
-              <w:top w:val="single" w:color="BFC7D1" w:sz="4"/>
-              <w:left w:val="single" w:color="BFC7D1" w:sz="4"/>
-              <w:bottom w:val="single" w:color="BFC7D1" w:sz="4"/>
-              <w:right w:val="single" w:color="BFC7D1" w:sz="4"/>
-            </w:tcBorders>
-            <w:tcMar>
-              <w:top w:type="dxa" w:w="60"/>
-              <w:left w:type="dxa" w:w="90"/>
-              <w:bottom w:type="dxa" w:w="60"/>
-              <w:right w:type="dxa" w:w="90"/>
-            </w:tcMar>
-          </w:tcPr>
-          <w:p>
-            <w:pPr>
-              <w:spacing w:after="0" w:line="252"/>
-            </w:pPr>
-            <w:r>
-              <w:rPr>
-                <w:sz w:val="18"/>
-                <w:szCs w:val="18"/>
-              </w:rPr>
-              <w:t xml:space="preserve">default media player</w:t>
-            </w:r>
-          </w:p>
-        </w:tc>
-      </w:tr>
-      <w:tr>
-        <w:trPr>
-          <w:cantSplit/>
-          <w:tblHeader w:val="false"/>
-        </w:trPr>
-        <w:tc>
-          <w:tcPr>
-            <w:tcW w:type="dxa" w:w="1771"/>
-            <w:tcBorders>
-              <w:top w:val="single" w:color="BFC7D1" w:sz="4"/>
-              <w:left w:val="single" w:color="BFC7D1" w:sz="4"/>
-              <w:bottom w:val="single" w:color="BFC7D1" w:sz="4"/>
-              <w:right w:val="single" w:color="BFC7D1" w:sz="4"/>
-            </w:tcBorders>
-            <w:tcMar>
-              <w:top w:type="dxa" w:w="60"/>
-              <w:left w:type="dxa" w:w="90"/>
-              <w:bottom w:type="dxa" w:w="60"/>
-              <w:right w:type="dxa" w:w="90"/>
-            </w:tcMar>
-          </w:tcPr>
-          <w:p>
-            <w:pPr>
-              <w:spacing w:after="0" w:line="252"/>
-            </w:pPr>
-            <w:r>
-              <w:rPr>
-                <w:sz w:val="18"/>
-                <w:szCs w:val="18"/>
-              </w:rPr>
-              <w:t xml:space="preserve">Access control</w:t>
-            </w:r>
-          </w:p>
-        </w:tc>
-        <w:tc>
-          <w:tcPr>
-            <w:tcW w:type="dxa" w:w="7589"/>
-            <w:tcBorders>
-              <w:top w:val="single" w:color="BFC7D1" w:sz="4"/>
-              <w:left w:val="single" w:color="BFC7D1" w:sz="4"/>
-              <w:bottom w:val="single" w:color="BFC7D1" w:sz="4"/>
-              <w:right w:val="single" w:color="BFC7D1" w:sz="4"/>
-            </w:tcBorders>
-            <w:tcMar>
-              <w:top w:type="dxa" w:w="60"/>
-              <w:left w:type="dxa" w:w="90"/>
-              <w:bottom w:type="dxa" w:w="60"/>
-              <w:right w:type="dxa" w:w="90"/>
-            </w:tcMar>
-          </w:tcPr>
-          <w:p>
-            <w:pPr>
-              <w:spacing w:after="0" w:line="252"/>
-            </w:pPr>
-            <w:r>
-              <w:rPr>
-                <w:sz w:val="18"/>
-                <w:szCs w:val="18"/>
-              </w:rPr>
-              <w:t xml:space="preserve">signed URL lifetime, failed attempts before lockout, attempt window, lockout duration</w:t>
-            </w:r>
-          </w:p>
-        </w:tc>
-      </w:tr>
-      <w:tr>
-        <w:trPr>
-          <w:cantSplit/>
-          <w:tblHeader w:val="false"/>
-        </w:trPr>
-        <w:tc>
-          <w:tcPr>
-            <w:tcW w:type="dxa" w:w="1771"/>
-            <w:tcBorders>
-              <w:top w:val="single" w:color="BFC7D1" w:sz="4"/>
-              <w:left w:val="single" w:color="BFC7D1" w:sz="4"/>
-              <w:bottom w:val="single" w:color="BFC7D1" w:sz="4"/>
-              <w:right w:val="single" w:color="BFC7D1" w:sz="4"/>
-            </w:tcBorders>
-            <w:tcMar>
-              <w:top w:type="dxa" w:w="60"/>
-              <w:left w:type="dxa" w:w="90"/>
-              <w:bottom w:type="dxa" w:w="60"/>
-              <w:right w:type="dxa" w:w="90"/>
-            </w:tcMar>
-          </w:tcPr>
-          <w:p>
-            <w:pPr>
-              <w:spacing w:after="0" w:line="252"/>
-            </w:pPr>
-            <w:r>
-              <w:rPr>
-                <w:sz w:val="18"/>
-                <w:szCs w:val="18"/>
-              </w:rPr>
-              <w:t xml:space="preserve">Privacy</w:t>
-            </w:r>
-          </w:p>
-        </w:tc>
-        <w:tc>
-          <w:tcPr>
-            <w:tcW w:type="dxa" w:w="7589"/>
-            <w:tcBorders>
-              <w:top w:val="single" w:color="BFC7D1" w:sz="4"/>
-              <w:left w:val="single" w:color="BFC7D1" w:sz="4"/>
-              <w:bottom w:val="single" w:color="BFC7D1" w:sz="4"/>
-              <w:right w:val="single" w:color="BFC7D1" w:sz="4"/>
-            </w:tcBorders>
-            <w:tcMar>
-              <w:top w:type="dxa" w:w="60"/>
-              <w:left w:type="dxa" w:w="90"/>
-              <w:bottom w:type="dxa" w:w="60"/>
-              <w:right w:type="dxa" w:w="90"/>
-            </w:tcMar>
-          </w:tcPr>
-          <w:p>
-            <w:pPr>
-              <w:spacing w:after="0" w:line="252"/>
-            </w:pPr>
-            <w:r>
-              <w:rPr>
-                <w:sz w:val="18"/>
-                <w:szCs w:val="18"/>
-              </w:rPr>
-              <w:t xml:space="preserve">how many months to keep watermark sessions and audit entries</w:t>
-            </w:r>
-          </w:p>
-        </w:tc>
-      </w:tr>
-      <w:tr>
-        <w:trPr>
-          <w:cantSplit/>
-          <w:tblHeader w:val="false"/>
-        </w:trPr>
-        <w:tc>
-          <w:tcPr>
-            <w:tcW w:type="dxa" w:w="1771"/>
-            <w:tcBorders>
-              <w:top w:val="single" w:color="BFC7D1" w:sz="4"/>
-              <w:left w:val="single" w:color="BFC7D1" w:sz="4"/>
-              <w:bottom w:val="single" w:color="BFC7D1" w:sz="4"/>
-              <w:right w:val="single" w:color="BFC7D1" w:sz="4"/>
-            </w:tcBorders>
-            <w:tcMar>
-              <w:top w:type="dxa" w:w="60"/>
-              <w:left w:type="dxa" w:w="90"/>
-              <w:bottom w:type="dxa" w:w="60"/>
-              <w:right w:type="dxa" w:w="90"/>
-            </w:tcMar>
-          </w:tcPr>
-          <w:p>
-            <w:pPr>
-              <w:spacing w:after="0" w:line="252"/>
-            </w:pPr>
-            <w:r>
-              <w:rPr>
-                <w:sz w:val="18"/>
-                <w:szCs w:val="18"/>
-              </w:rPr>
-              <w:t xml:space="preserve">AI</w:t>
-            </w:r>
-          </w:p>
-        </w:tc>
-        <w:tc>
-          <w:tcPr>
-            <w:tcW w:type="dxa" w:w="7589"/>
-            <w:tcBorders>
-              <w:top w:val="single" w:color="BFC7D1" w:sz="4"/>
-              <w:left w:val="single" w:color="BFC7D1" w:sz="4"/>
-              <w:bottom w:val="single" w:color="BFC7D1" w:sz="4"/>
-              <w:right w:val="single" w:color="BFC7D1" w:sz="4"/>
-            </w:tcBorders>
-            <w:tcMar>
-              <w:top w:type="dxa" w:w="60"/>
-              <w:left w:type="dxa" w:w="90"/>
-              <w:bottom w:type="dxa" w:w="60"/>
-              <w:right w:type="dxa" w:w="90"/>
-            </w:tcMar>
-          </w:tcPr>
-          <w:p>
-            <w:pPr>
-              <w:spacing w:after="0" w:line="252"/>
-            </w:pPr>
-            <w:r>
-              <w:rPr>
-                <w:sz w:val="18"/>
-                <w:szCs w:val="18"/>
-              </w:rPr>
-              <w:t xml:space="preserve">Anthropic API key and Claude model for the Google Business Profile assistant</w:t>
-            </w:r>
-          </w:p>
-        </w:tc>
-      </w:tr>
-    </w:tbl>
-    <w:p>
-      <w:pPr>
-        <w:spacing w:after="120"/>
-      </w:pPr>
+        <w:t xml:space="preserve">The Joomla status page (mock-up)</w:t>
+      </w:r>
     </w:p>
     <w:p>
       <w:pPr>
         <w:spacing w:after="120" w:line="276"/>
       </w:pPr>
       <w:r>
-        <w:t xml:space="preserve">Secrets such as the API key are stored encrypted. The field shows only the last four characters after saving; leave it as it is to keep the stored value.</w:t>
+        <w:t xml:space="preserve">Both show whether the server is running, the store address, the local port, the data folder, the last error and the log tail, with buttons to start, restart and stop. The server is also checked and restarted automatically whenever the store is used.</w:t>
       </w:r>
     </w:p>
     <w:p>
@@ -1358,7 +817,7 @@
         <w:spacing w:after="120" w:before="360"/>
       </w:pPr>
       <w:r>
-        <w:t xml:space="preserve">6. Health</w:t>
+        <w:t xml:space="preserve">5. Connected site (Bridges)</w:t>
       </w:r>
     </w:p>
     <w:p>
@@ -1370,10 +829,10 @@
           <w:b/>
           <w:bCs/>
         </w:rPr>
-        <w:t xml:space="preserve">Health</w:t>
-      </w:r>
-      <w:r>
-        <w:t xml:space="preserve"> tells you whether the server is ready. Each row is green (ok), amber (warning: a feature is unavailable) or red (something must be fixed).</w:t>
+        <w:t xml:space="preserve">Bridges</w:t>
+      </w:r>
+      <w:r>
+        <w:t xml:space="preserve"> in the store admin lists the website the store runs in. The package registers it automatically with its address and a secret, and marks it as trusted for administrator sign-in. Nothing needs to be entered here for the normal single-site setup.</w:t>
       </w:r>
     </w:p>
     <w:p>
@@ -1442,7 +901,7 @@
           <w:sz w:val="18"/>
           <w:szCs w:val="18"/>
         </w:rPr>
-        <w:t xml:space="preserve">The Health page</w:t>
+        <w:t xml:space="preserve">The Bridges page showing the site registered by the package</w:t>
       </w:r>
     </w:p>
     <w:p>
@@ -1450,29 +909,7 @@
         <w:spacing w:after="120" w:line="276"/>
       </w:pPr>
       <w:r>
-        <w:t xml:space="preserve">The same report is available to scripts at </w:t>
-      </w:r>
-      <w:r>
-        <w:rPr>
-          <w:rFonts w:ascii="Consolas" w:cs="Consolas" w:eastAsia="Consolas" w:hAnsi="Consolas"/>
-          <w:sz w:val="19"/>
-          <w:szCs w:val="19"/>
-        </w:rPr>
-        <w:t xml:space="preserve">/api/v1/health</w:t>
-      </w:r>
-      <w:r>
-        <w:t xml:space="preserve"> and on the command line with </w:t>
-      </w:r>
-      <w:r>
-        <w:rPr>
-          <w:rFonts w:ascii="Consolas" w:cs="Consolas" w:eastAsia="Consolas" w:hAnsi="Consolas"/>
-          <w:sz w:val="19"/>
-          <w:szCs w:val="19"/>
-        </w:rPr>
-        <w:t xml:space="preserve">mms-server health</w:t>
-      </w:r>
-      <w:r>
-        <w:t xml:space="preserve">.</w:t>
+        <w:t xml:space="preserve">Advanced use: a second website (for example a WordPress site and a Joomla site sharing one store) can be added here; that site would then run the package in "connect only" mode, which is planned for a later release.</w:t>
       </w:r>
     </w:p>
     <w:p>
@@ -1483,7 +920,7 @@
         <w:spacing w:after="120" w:before="360"/>
       </w:pPr>
       <w:r>
-        <w:t xml:space="preserve">7. The store on your website</w:t>
+        <w:t xml:space="preserve">6. Settings</w:t>
       </w:r>
     </w:p>
     <w:p>
@@ -1491,7 +928,24 @@
         <w:spacing w:after="120" w:line="276"/>
       </w:pPr>
       <w:r>
-        <w:t xml:space="preserve">The showcase is the store front. It lists published products with a type badge, title, description and price, and offers two layouts.</w:t>
+        <w:rPr>
+          <w:b/>
+          <w:bCs/>
+        </w:rPr>
+        <w:t xml:space="preserve">Settings</w:t>
+      </w:r>
+      <w:r>
+        <w:t xml:space="preserve"> groups every runtime option. Change values and click </w:t>
+      </w:r>
+      <w:r>
+        <w:rPr>
+          <w:b/>
+          <w:bCs/>
+        </w:rPr>
+        <w:t xml:space="preserve">Save settings</w:t>
+      </w:r>
+      <w:r>
+        <w:t xml:space="preserve">. Invalid values are refused with a message and nothing is saved.</w:t>
       </w:r>
     </w:p>
     <w:p>
@@ -1560,7 +1014,583 @@
           <w:sz w:val="18"/>
           <w:szCs w:val="18"/>
         </w:rPr>
-        <w:t xml:space="preserve">The showcase in grid view</w:t>
+        <w:t xml:space="preserve">The settings page</w:t>
+      </w:r>
+    </w:p>
+    <w:tbl>
+      <w:tblPr>
+        <w:tblW w:type="dxa" w:w="9360"/>
+        <w:tblBorders>
+          <w:top w:val="single" w:color="auto" w:sz="4"/>
+          <w:left w:val="single" w:color="auto" w:sz="4"/>
+          <w:bottom w:val="single" w:color="auto" w:sz="4"/>
+          <w:right w:val="single" w:color="auto" w:sz="4"/>
+          <w:insideH w:val="single" w:color="auto" w:sz="4"/>
+          <w:insideV w:val="single" w:color="auto" w:sz="4"/>
+        </w:tblBorders>
+      </w:tblPr>
+      <w:tblGrid>
+        <w:gridCol w:w="1771"/>
+        <w:gridCol w:w="7589"/>
+      </w:tblGrid>
+      <w:tr>
+        <w:trPr>
+          <w:cantSplit/>
+          <w:tblHeader/>
+        </w:trPr>
+        <w:tc>
+          <w:tcPr>
+            <w:tcW w:type="dxa" w:w="1771"/>
+            <w:tcBorders>
+              <w:top w:val="single" w:color="BFC7D1" w:sz="4"/>
+              <w:left w:val="single" w:color="BFC7D1" w:sz="4"/>
+              <w:bottom w:val="single" w:color="BFC7D1" w:sz="4"/>
+              <w:right w:val="single" w:color="BFC7D1" w:sz="4"/>
+            </w:tcBorders>
+            <w:shd w:fill="1F3A5F" w:color="auto" w:val="clear"/>
+            <w:tcMar>
+              <w:top w:type="dxa" w:w="60"/>
+              <w:left w:type="dxa" w:w="90"/>
+              <w:bottom w:type="dxa" w:w="60"/>
+              <w:right w:type="dxa" w:w="90"/>
+            </w:tcMar>
+          </w:tcPr>
+          <w:p>
+            <w:pPr>
+              <w:spacing w:after="0" w:line="252"/>
+            </w:pPr>
+            <w:r>
+              <w:rPr>
+                <w:b/>
+                <w:bCs/>
+                <w:color w:val="FFFFFF"/>
+                <w:sz w:val="18"/>
+                <w:szCs w:val="18"/>
+              </w:rPr>
+              <w:t xml:space="preserve">Section</w:t>
+            </w:r>
+          </w:p>
+        </w:tc>
+        <w:tc>
+          <w:tcPr>
+            <w:tcW w:type="dxa" w:w="7589"/>
+            <w:tcBorders>
+              <w:top w:val="single" w:color="BFC7D1" w:sz="4"/>
+              <w:left w:val="single" w:color="BFC7D1" w:sz="4"/>
+              <w:bottom w:val="single" w:color="BFC7D1" w:sz="4"/>
+              <w:right w:val="single" w:color="BFC7D1" w:sz="4"/>
+            </w:tcBorders>
+            <w:shd w:fill="1F3A5F" w:color="auto" w:val="clear"/>
+            <w:tcMar>
+              <w:top w:type="dxa" w:w="60"/>
+              <w:left w:type="dxa" w:w="90"/>
+              <w:bottom w:type="dxa" w:w="60"/>
+              <w:right w:type="dxa" w:w="90"/>
+            </w:tcMar>
+          </w:tcPr>
+          <w:p>
+            <w:pPr>
+              <w:spacing w:after="0" w:line="252"/>
+            </w:pPr>
+            <w:r>
+              <w:rPr>
+                <w:b/>
+                <w:bCs/>
+                <w:color w:val="FFFFFF"/>
+                <w:sz w:val="18"/>
+                <w:szCs w:val="18"/>
+              </w:rPr>
+              <w:t xml:space="preserve">Settings</w:t>
+            </w:r>
+          </w:p>
+        </w:tc>
+      </w:tr>
+      <w:tr>
+        <w:trPr>
+          <w:cantSplit/>
+          <w:tblHeader w:val="false"/>
+        </w:trPr>
+        <w:tc>
+          <w:tcPr>
+            <w:tcW w:type="dxa" w:w="1771"/>
+            <w:tcBorders>
+              <w:top w:val="single" w:color="BFC7D1" w:sz="4"/>
+              <w:left w:val="single" w:color="BFC7D1" w:sz="4"/>
+              <w:bottom w:val="single" w:color="BFC7D1" w:sz="4"/>
+              <w:right w:val="single" w:color="BFC7D1" w:sz="4"/>
+            </w:tcBorders>
+            <w:tcMar>
+              <w:top w:type="dxa" w:w="60"/>
+              <w:left w:type="dxa" w:w="90"/>
+              <w:bottom w:type="dxa" w:w="60"/>
+              <w:right w:type="dxa" w:w="90"/>
+            </w:tcMar>
+          </w:tcPr>
+          <w:p>
+            <w:pPr>
+              <w:spacing w:after="0" w:line="252"/>
+            </w:pPr>
+            <w:r>
+              <w:rPr>
+                <w:sz w:val="18"/>
+                <w:szCs w:val="18"/>
+              </w:rPr>
+              <w:t xml:space="preserve">General</w:t>
+            </w:r>
+          </w:p>
+        </w:tc>
+        <w:tc>
+          <w:tcPr>
+            <w:tcW w:type="dxa" w:w="7589"/>
+            <w:tcBorders>
+              <w:top w:val="single" w:color="BFC7D1" w:sz="4"/>
+              <w:left w:val="single" w:color="BFC7D1" w:sz="4"/>
+              <w:bottom w:val="single" w:color="BFC7D1" w:sz="4"/>
+              <w:right w:val="single" w:color="BFC7D1" w:sz="4"/>
+            </w:tcBorders>
+            <w:tcMar>
+              <w:top w:type="dxa" w:w="60"/>
+              <w:left w:type="dxa" w:w="90"/>
+              <w:bottom w:type="dxa" w:w="60"/>
+              <w:right w:type="dxa" w:w="90"/>
+            </w:tcMar>
+          </w:tcPr>
+          <w:p>
+            <w:pPr>
+              <w:spacing w:after="0" w:line="252"/>
+            </w:pPr>
+            <w:r>
+              <w:rPr>
+                <w:sz w:val="18"/>
+                <w:szCs w:val="18"/>
+              </w:rPr>
+              <w:t xml:space="preserve">store name (shown in embeds, emails and receipts), log level</w:t>
+            </w:r>
+          </w:p>
+        </w:tc>
+      </w:tr>
+      <w:tr>
+        <w:trPr>
+          <w:cantSplit/>
+          <w:tblHeader w:val="false"/>
+        </w:trPr>
+        <w:tc>
+          <w:tcPr>
+            <w:tcW w:type="dxa" w:w="1771"/>
+            <w:tcBorders>
+              <w:top w:val="single" w:color="BFC7D1" w:sz="4"/>
+              <w:left w:val="single" w:color="BFC7D1" w:sz="4"/>
+              <w:bottom w:val="single" w:color="BFC7D1" w:sz="4"/>
+              <w:right w:val="single" w:color="BFC7D1" w:sz="4"/>
+            </w:tcBorders>
+            <w:tcMar>
+              <w:top w:type="dxa" w:w="60"/>
+              <w:left w:type="dxa" w:w="90"/>
+              <w:bottom w:type="dxa" w:w="60"/>
+              <w:right w:type="dxa" w:w="90"/>
+            </w:tcMar>
+          </w:tcPr>
+          <w:p>
+            <w:pPr>
+              <w:spacing w:after="0" w:line="252"/>
+            </w:pPr>
+            <w:r>
+              <w:rPr>
+                <w:sz w:val="18"/>
+                <w:szCs w:val="18"/>
+              </w:rPr>
+              <w:t xml:space="preserve">Store</w:t>
+            </w:r>
+          </w:p>
+        </w:tc>
+        <w:tc>
+          <w:tcPr>
+            <w:tcW w:type="dxa" w:w="7589"/>
+            <w:tcBorders>
+              <w:top w:val="single" w:color="BFC7D1" w:sz="4"/>
+              <w:left w:val="single" w:color="BFC7D1" w:sz="4"/>
+              <w:bottom w:val="single" w:color="BFC7D1" w:sz="4"/>
+              <w:right w:val="single" w:color="BFC7D1" w:sz="4"/>
+            </w:tcBorders>
+            <w:tcMar>
+              <w:top w:type="dxa" w:w="60"/>
+              <w:left w:type="dxa" w:w="90"/>
+              <w:bottom w:type="dxa" w:w="60"/>
+              <w:right w:type="dxa" w:w="90"/>
+            </w:tcMar>
+          </w:tcPr>
+          <w:p>
+            <w:pPr>
+              <w:spacing w:after="0" w:line="252"/>
+            </w:pPr>
+            <w:r>
+              <w:rPr>
+                <w:sz w:val="18"/>
+                <w:szCs w:val="18"/>
+              </w:rPr>
+              <w:t xml:space="preserve">base currency, receipt number prefix</w:t>
+            </w:r>
+          </w:p>
+        </w:tc>
+      </w:tr>
+      <w:tr>
+        <w:trPr>
+          <w:cantSplit/>
+          <w:tblHeader w:val="false"/>
+        </w:trPr>
+        <w:tc>
+          <w:tcPr>
+            <w:tcW w:type="dxa" w:w="1771"/>
+            <w:tcBorders>
+              <w:top w:val="single" w:color="BFC7D1" w:sz="4"/>
+              <w:left w:val="single" w:color="BFC7D1" w:sz="4"/>
+              <w:bottom w:val="single" w:color="BFC7D1" w:sz="4"/>
+              <w:right w:val="single" w:color="BFC7D1" w:sz="4"/>
+            </w:tcBorders>
+            <w:tcMar>
+              <w:top w:type="dxa" w:w="60"/>
+              <w:left w:type="dxa" w:w="90"/>
+              <w:bottom w:type="dxa" w:w="60"/>
+              <w:right w:type="dxa" w:w="90"/>
+            </w:tcMar>
+          </w:tcPr>
+          <w:p>
+            <w:pPr>
+              <w:spacing w:after="0" w:line="252"/>
+            </w:pPr>
+            <w:r>
+              <w:rPr>
+                <w:sz w:val="18"/>
+                <w:szCs w:val="18"/>
+              </w:rPr>
+              <w:t xml:space="preserve">Media</w:t>
+            </w:r>
+          </w:p>
+        </w:tc>
+        <w:tc>
+          <w:tcPr>
+            <w:tcW w:type="dxa" w:w="7589"/>
+            <w:tcBorders>
+              <w:top w:val="single" w:color="BFC7D1" w:sz="4"/>
+              <w:left w:val="single" w:color="BFC7D1" w:sz="4"/>
+              <w:bottom w:val="single" w:color="BFC7D1" w:sz="4"/>
+              <w:right w:val="single" w:color="BFC7D1" w:sz="4"/>
+            </w:tcBorders>
+            <w:tcMar>
+              <w:top w:type="dxa" w:w="60"/>
+              <w:left w:type="dxa" w:w="90"/>
+              <w:bottom w:type="dxa" w:w="60"/>
+              <w:right w:type="dxa" w:w="90"/>
+            </w:tcMar>
+          </w:tcPr>
+          <w:p>
+            <w:pPr>
+              <w:spacing w:after="0" w:line="252"/>
+            </w:pPr>
+            <w:r>
+              <w:rPr>
+                <w:sz w:val="18"/>
+                <w:szCs w:val="18"/>
+              </w:rPr>
+              <w:t xml:space="preserve">maximum upload size, path to ffmpeg</w:t>
+            </w:r>
+          </w:p>
+        </w:tc>
+      </w:tr>
+      <w:tr>
+        <w:trPr>
+          <w:cantSplit/>
+          <w:tblHeader w:val="false"/>
+        </w:trPr>
+        <w:tc>
+          <w:tcPr>
+            <w:tcW w:type="dxa" w:w="1771"/>
+            <w:tcBorders>
+              <w:top w:val="single" w:color="BFC7D1" w:sz="4"/>
+              <w:left w:val="single" w:color="BFC7D1" w:sz="4"/>
+              <w:bottom w:val="single" w:color="BFC7D1" w:sz="4"/>
+              <w:right w:val="single" w:color="BFC7D1" w:sz="4"/>
+            </w:tcBorders>
+            <w:tcMar>
+              <w:top w:type="dxa" w:w="60"/>
+              <w:left w:type="dxa" w:w="90"/>
+              <w:bottom w:type="dxa" w:w="60"/>
+              <w:right w:type="dxa" w:w="90"/>
+            </w:tcMar>
+          </w:tcPr>
+          <w:p>
+            <w:pPr>
+              <w:spacing w:after="0" w:line="252"/>
+            </w:pPr>
+            <w:r>
+              <w:rPr>
+                <w:sz w:val="18"/>
+                <w:szCs w:val="18"/>
+              </w:rPr>
+              <w:t xml:space="preserve">Players</w:t>
+            </w:r>
+          </w:p>
+        </w:tc>
+        <w:tc>
+          <w:tcPr>
+            <w:tcW w:type="dxa" w:w="7589"/>
+            <w:tcBorders>
+              <w:top w:val="single" w:color="BFC7D1" w:sz="4"/>
+              <w:left w:val="single" w:color="BFC7D1" w:sz="4"/>
+              <w:bottom w:val="single" w:color="BFC7D1" w:sz="4"/>
+              <w:right w:val="single" w:color="BFC7D1" w:sz="4"/>
+            </w:tcBorders>
+            <w:tcMar>
+              <w:top w:type="dxa" w:w="60"/>
+              <w:left w:type="dxa" w:w="90"/>
+              <w:bottom w:type="dxa" w:w="60"/>
+              <w:right w:type="dxa" w:w="90"/>
+            </w:tcMar>
+          </w:tcPr>
+          <w:p>
+            <w:pPr>
+              <w:spacing w:after="0" w:line="252"/>
+            </w:pPr>
+            <w:r>
+              <w:rPr>
+                <w:sz w:val="18"/>
+                <w:szCs w:val="18"/>
+              </w:rPr>
+              <w:t xml:space="preserve">default media player</w:t>
+            </w:r>
+          </w:p>
+        </w:tc>
+      </w:tr>
+      <w:tr>
+        <w:trPr>
+          <w:cantSplit/>
+          <w:tblHeader w:val="false"/>
+        </w:trPr>
+        <w:tc>
+          <w:tcPr>
+            <w:tcW w:type="dxa" w:w="1771"/>
+            <w:tcBorders>
+              <w:top w:val="single" w:color="BFC7D1" w:sz="4"/>
+              <w:left w:val="single" w:color="BFC7D1" w:sz="4"/>
+              <w:bottom w:val="single" w:color="BFC7D1" w:sz="4"/>
+              <w:right w:val="single" w:color="BFC7D1" w:sz="4"/>
+            </w:tcBorders>
+            <w:tcMar>
+              <w:top w:type="dxa" w:w="60"/>
+              <w:left w:type="dxa" w:w="90"/>
+              <w:bottom w:type="dxa" w:w="60"/>
+              <w:right w:type="dxa" w:w="90"/>
+            </w:tcMar>
+          </w:tcPr>
+          <w:p>
+            <w:pPr>
+              <w:spacing w:after="0" w:line="252"/>
+            </w:pPr>
+            <w:r>
+              <w:rPr>
+                <w:sz w:val="18"/>
+                <w:szCs w:val="18"/>
+              </w:rPr>
+              <w:t xml:space="preserve">Access control</w:t>
+            </w:r>
+          </w:p>
+        </w:tc>
+        <w:tc>
+          <w:tcPr>
+            <w:tcW w:type="dxa" w:w="7589"/>
+            <w:tcBorders>
+              <w:top w:val="single" w:color="BFC7D1" w:sz="4"/>
+              <w:left w:val="single" w:color="BFC7D1" w:sz="4"/>
+              <w:bottom w:val="single" w:color="BFC7D1" w:sz="4"/>
+              <w:right w:val="single" w:color="BFC7D1" w:sz="4"/>
+            </w:tcBorders>
+            <w:tcMar>
+              <w:top w:type="dxa" w:w="60"/>
+              <w:left w:type="dxa" w:w="90"/>
+              <w:bottom w:type="dxa" w:w="60"/>
+              <w:right w:type="dxa" w:w="90"/>
+            </w:tcMar>
+          </w:tcPr>
+          <w:p>
+            <w:pPr>
+              <w:spacing w:after="0" w:line="252"/>
+            </w:pPr>
+            <w:r>
+              <w:rPr>
+                <w:sz w:val="18"/>
+                <w:szCs w:val="18"/>
+              </w:rPr>
+              <w:t xml:space="preserve">signed URL lifetime, failed attempts before lockout, attempt window, lockout duration</w:t>
+            </w:r>
+          </w:p>
+        </w:tc>
+      </w:tr>
+      <w:tr>
+        <w:trPr>
+          <w:cantSplit/>
+          <w:tblHeader w:val="false"/>
+        </w:trPr>
+        <w:tc>
+          <w:tcPr>
+            <w:tcW w:type="dxa" w:w="1771"/>
+            <w:tcBorders>
+              <w:top w:val="single" w:color="BFC7D1" w:sz="4"/>
+              <w:left w:val="single" w:color="BFC7D1" w:sz="4"/>
+              <w:bottom w:val="single" w:color="BFC7D1" w:sz="4"/>
+              <w:right w:val="single" w:color="BFC7D1" w:sz="4"/>
+            </w:tcBorders>
+            <w:tcMar>
+              <w:top w:type="dxa" w:w="60"/>
+              <w:left w:type="dxa" w:w="90"/>
+              <w:bottom w:type="dxa" w:w="60"/>
+              <w:right w:type="dxa" w:w="90"/>
+            </w:tcMar>
+          </w:tcPr>
+          <w:p>
+            <w:pPr>
+              <w:spacing w:after="0" w:line="252"/>
+            </w:pPr>
+            <w:r>
+              <w:rPr>
+                <w:sz w:val="18"/>
+                <w:szCs w:val="18"/>
+              </w:rPr>
+              <w:t xml:space="preserve">Privacy</w:t>
+            </w:r>
+          </w:p>
+        </w:tc>
+        <w:tc>
+          <w:tcPr>
+            <w:tcW w:type="dxa" w:w="7589"/>
+            <w:tcBorders>
+              <w:top w:val="single" w:color="BFC7D1" w:sz="4"/>
+              <w:left w:val="single" w:color="BFC7D1" w:sz="4"/>
+              <w:bottom w:val="single" w:color="BFC7D1" w:sz="4"/>
+              <w:right w:val="single" w:color="BFC7D1" w:sz="4"/>
+            </w:tcBorders>
+            <w:tcMar>
+              <w:top w:type="dxa" w:w="60"/>
+              <w:left w:type="dxa" w:w="90"/>
+              <w:bottom w:type="dxa" w:w="60"/>
+              <w:right w:type="dxa" w:w="90"/>
+            </w:tcMar>
+          </w:tcPr>
+          <w:p>
+            <w:pPr>
+              <w:spacing w:after="0" w:line="252"/>
+            </w:pPr>
+            <w:r>
+              <w:rPr>
+                <w:sz w:val="18"/>
+                <w:szCs w:val="18"/>
+              </w:rPr>
+              <w:t xml:space="preserve">how many months to keep watermark sessions and audit entries</w:t>
+            </w:r>
+          </w:p>
+        </w:tc>
+      </w:tr>
+      <w:tr>
+        <w:trPr>
+          <w:cantSplit/>
+          <w:tblHeader w:val="false"/>
+        </w:trPr>
+        <w:tc>
+          <w:tcPr>
+            <w:tcW w:type="dxa" w:w="1771"/>
+            <w:tcBorders>
+              <w:top w:val="single" w:color="BFC7D1" w:sz="4"/>
+              <w:left w:val="single" w:color="BFC7D1" w:sz="4"/>
+              <w:bottom w:val="single" w:color="BFC7D1" w:sz="4"/>
+              <w:right w:val="single" w:color="BFC7D1" w:sz="4"/>
+            </w:tcBorders>
+            <w:tcMar>
+              <w:top w:type="dxa" w:w="60"/>
+              <w:left w:type="dxa" w:w="90"/>
+              <w:bottom w:type="dxa" w:w="60"/>
+              <w:right w:type="dxa" w:w="90"/>
+            </w:tcMar>
+          </w:tcPr>
+          <w:p>
+            <w:pPr>
+              <w:spacing w:after="0" w:line="252"/>
+            </w:pPr>
+            <w:r>
+              <w:rPr>
+                <w:sz w:val="18"/>
+                <w:szCs w:val="18"/>
+              </w:rPr>
+              <w:t xml:space="preserve">AI</w:t>
+            </w:r>
+          </w:p>
+        </w:tc>
+        <w:tc>
+          <w:tcPr>
+            <w:tcW w:type="dxa" w:w="7589"/>
+            <w:tcBorders>
+              <w:top w:val="single" w:color="BFC7D1" w:sz="4"/>
+              <w:left w:val="single" w:color="BFC7D1" w:sz="4"/>
+              <w:bottom w:val="single" w:color="BFC7D1" w:sz="4"/>
+              <w:right w:val="single" w:color="BFC7D1" w:sz="4"/>
+            </w:tcBorders>
+            <w:tcMar>
+              <w:top w:type="dxa" w:w="60"/>
+              <w:left w:type="dxa" w:w="90"/>
+              <w:bottom w:type="dxa" w:w="60"/>
+              <w:right w:type="dxa" w:w="90"/>
+            </w:tcMar>
+          </w:tcPr>
+          <w:p>
+            <w:pPr>
+              <w:spacing w:after="0" w:line="252"/>
+            </w:pPr>
+            <w:r>
+              <w:rPr>
+                <w:sz w:val="18"/>
+                <w:szCs w:val="18"/>
+              </w:rPr>
+              <w:t xml:space="preserve">Anthropic API key and Claude model for the Google Business Profile assistant</w:t>
+            </w:r>
+          </w:p>
+        </w:tc>
+      </w:tr>
+    </w:tbl>
+    <w:p>
+      <w:pPr>
+        <w:spacing w:after="120"/>
+      </w:pPr>
+    </w:p>
+    <w:p>
+      <w:pPr>
+        <w:spacing w:after="120" w:line="276"/>
+      </w:pPr>
+      <w:r>
+        <w:t xml:space="preserve">Secrets such as the API key are stored encrypted. The field shows only the last four characters after saving; leave it as it is to keep the stored value.</w:t>
+      </w:r>
+    </w:p>
+    <w:p>
+      <w:pPr>
+        <w:pStyle w:val="Heading1"/>
+        <w:keepNext/>
+        <w:pageBreakBefore/>
+        <w:spacing w:after="120" w:before="360"/>
+      </w:pPr>
+      <w:r>
+        <w:t xml:space="preserve">7. Health</w:t>
+      </w:r>
+    </w:p>
+    <w:p>
+      <w:pPr>
+        <w:spacing w:after="120" w:line="276"/>
+      </w:pPr>
+      <w:r>
+        <w:rPr>
+          <w:b/>
+          <w:bCs/>
+        </w:rPr>
+        <w:t xml:space="preserve">Health</w:t>
+      </w:r>
+      <w:r>
+        <w:t xml:space="preserve"> tells you whether the store is ready. Each row is green (ok), amber (warning: a feature is unavailable) or red (something must be fixed).</w:t>
       </w:r>
     </w:p>
     <w:p>
@@ -1629,7 +1659,611 @@
           <w:sz w:val="18"/>
           <w:szCs w:val="18"/>
         </w:rPr>
-        <w:t xml:space="preserve">The showcase in list view</w:t>
+        <w:t xml:space="preserve">The Health page</w:t>
+      </w:r>
+    </w:p>
+    <w:tbl>
+      <w:tblPr>
+        <w:tblW w:type="dxa" w:w="9360"/>
+        <w:tblBorders>
+          <w:top w:val="single" w:color="auto" w:sz="4"/>
+          <w:left w:val="single" w:color="auto" w:sz="4"/>
+          <w:bottom w:val="single" w:color="auto" w:sz="4"/>
+          <w:right w:val="single" w:color="auto" w:sz="4"/>
+          <w:insideH w:val="single" w:color="auto" w:sz="4"/>
+          <w:insideV w:val="single" w:color="auto" w:sz="4"/>
+        </w:tblBorders>
+      </w:tblPr>
+      <w:tblGrid>
+        <w:gridCol w:w="2321"/>
+        <w:gridCol w:w="2546"/>
+        <w:gridCol w:w="4493"/>
+      </w:tblGrid>
+      <w:tr>
+        <w:trPr>
+          <w:cantSplit/>
+          <w:tblHeader/>
+        </w:trPr>
+        <w:tc>
+          <w:tcPr>
+            <w:tcW w:type="dxa" w:w="2321"/>
+            <w:tcBorders>
+              <w:top w:val="single" w:color="BFC7D1" w:sz="4"/>
+              <w:left w:val="single" w:color="BFC7D1" w:sz="4"/>
+              <w:bottom w:val="single" w:color="BFC7D1" w:sz="4"/>
+              <w:right w:val="single" w:color="BFC7D1" w:sz="4"/>
+            </w:tcBorders>
+            <w:shd w:fill="1F3A5F" w:color="auto" w:val="clear"/>
+            <w:tcMar>
+              <w:top w:type="dxa" w:w="60"/>
+              <w:left w:type="dxa" w:w="90"/>
+              <w:bottom w:type="dxa" w:w="60"/>
+              <w:right w:type="dxa" w:w="90"/>
+            </w:tcMar>
+          </w:tcPr>
+          <w:p>
+            <w:pPr>
+              <w:spacing w:after="0" w:line="252"/>
+            </w:pPr>
+            <w:r>
+              <w:rPr>
+                <w:b/>
+                <w:bCs/>
+                <w:color w:val="FFFFFF"/>
+                <w:sz w:val="18"/>
+                <w:szCs w:val="18"/>
+              </w:rPr>
+              <w:t xml:space="preserve">Row</w:t>
+            </w:r>
+          </w:p>
+        </w:tc>
+        <w:tc>
+          <w:tcPr>
+            <w:tcW w:type="dxa" w:w="2546"/>
+            <w:tcBorders>
+              <w:top w:val="single" w:color="BFC7D1" w:sz="4"/>
+              <w:left w:val="single" w:color="BFC7D1" w:sz="4"/>
+              <w:bottom w:val="single" w:color="BFC7D1" w:sz="4"/>
+              <w:right w:val="single" w:color="BFC7D1" w:sz="4"/>
+            </w:tcBorders>
+            <w:shd w:fill="1F3A5F" w:color="auto" w:val="clear"/>
+            <w:tcMar>
+              <w:top w:type="dxa" w:w="60"/>
+              <w:left w:type="dxa" w:w="90"/>
+              <w:bottom w:type="dxa" w:w="60"/>
+              <w:right w:type="dxa" w:w="90"/>
+            </w:tcMar>
+          </w:tcPr>
+          <w:p>
+            <w:pPr>
+              <w:spacing w:after="0" w:line="252"/>
+            </w:pPr>
+            <w:r>
+              <w:rPr>
+                <w:b/>
+                <w:bCs/>
+                <w:color w:val="FFFFFF"/>
+                <w:sz w:val="18"/>
+                <w:szCs w:val="18"/>
+              </w:rPr>
+              <w:t xml:space="preserve">What it checks</w:t>
+            </w:r>
+          </w:p>
+        </w:tc>
+        <w:tc>
+          <w:tcPr>
+            <w:tcW w:type="dxa" w:w="4493"/>
+            <w:tcBorders>
+              <w:top w:val="single" w:color="BFC7D1" w:sz="4"/>
+              <w:left w:val="single" w:color="BFC7D1" w:sz="4"/>
+              <w:bottom w:val="single" w:color="BFC7D1" w:sz="4"/>
+              <w:right w:val="single" w:color="BFC7D1" w:sz="4"/>
+            </w:tcBorders>
+            <w:shd w:fill="1F3A5F" w:color="auto" w:val="clear"/>
+            <w:tcMar>
+              <w:top w:type="dxa" w:w="60"/>
+              <w:left w:type="dxa" w:w="90"/>
+              <w:bottom w:type="dxa" w:w="60"/>
+              <w:right w:type="dxa" w:w="90"/>
+            </w:tcMar>
+          </w:tcPr>
+          <w:p>
+            <w:pPr>
+              <w:spacing w:after="0" w:line="252"/>
+            </w:pPr>
+            <w:r>
+              <w:rPr>
+                <w:b/>
+                <w:bCs/>
+                <w:color w:val="FFFFFF"/>
+                <w:sz w:val="18"/>
+                <w:szCs w:val="18"/>
+              </w:rPr>
+              <w:t xml:space="preserve">If it is not green</w:t>
+            </w:r>
+          </w:p>
+        </w:tc>
+      </w:tr>
+      <w:tr>
+        <w:trPr>
+          <w:cantSplit/>
+          <w:tblHeader w:val="false"/>
+        </w:trPr>
+        <w:tc>
+          <w:tcPr>
+            <w:tcW w:type="dxa" w:w="2321"/>
+            <w:tcBorders>
+              <w:top w:val="single" w:color="BFC7D1" w:sz="4"/>
+              <w:left w:val="single" w:color="BFC7D1" w:sz="4"/>
+              <w:bottom w:val="single" w:color="BFC7D1" w:sz="4"/>
+              <w:right w:val="single" w:color="BFC7D1" w:sz="4"/>
+            </w:tcBorders>
+            <w:tcMar>
+              <w:top w:type="dxa" w:w="60"/>
+              <w:left w:type="dxa" w:w="90"/>
+              <w:bottom w:type="dxa" w:w="60"/>
+              <w:right w:type="dxa" w:w="90"/>
+            </w:tcMar>
+          </w:tcPr>
+          <w:p>
+            <w:pPr>
+              <w:spacing w:after="0" w:line="252"/>
+            </w:pPr>
+            <w:r>
+              <w:rPr>
+                <w:sz w:val="18"/>
+                <w:szCs w:val="18"/>
+              </w:rPr>
+              <w:t xml:space="preserve">database</w:t>
+            </w:r>
+          </w:p>
+        </w:tc>
+        <w:tc>
+          <w:tcPr>
+            <w:tcW w:type="dxa" w:w="2546"/>
+            <w:tcBorders>
+              <w:top w:val="single" w:color="BFC7D1" w:sz="4"/>
+              <w:left w:val="single" w:color="BFC7D1" w:sz="4"/>
+              <w:bottom w:val="single" w:color="BFC7D1" w:sz="4"/>
+              <w:right w:val="single" w:color="BFC7D1" w:sz="4"/>
+            </w:tcBorders>
+            <w:tcMar>
+              <w:top w:type="dxa" w:w="60"/>
+              <w:left w:type="dxa" w:w="90"/>
+              <w:bottom w:type="dxa" w:w="60"/>
+              <w:right w:type="dxa" w:w="90"/>
+            </w:tcMar>
+          </w:tcPr>
+          <w:p>
+            <w:pPr>
+              <w:spacing w:after="0" w:line="252"/>
+            </w:pPr>
+            <w:r>
+              <w:rPr>
+                <w:sz w:val="18"/>
+                <w:szCs w:val="18"/>
+              </w:rPr>
+              <w:t xml:space="preserve">the store database opens</w:t>
+            </w:r>
+          </w:p>
+        </w:tc>
+        <w:tc>
+          <w:tcPr>
+            <w:tcW w:type="dxa" w:w="4493"/>
+            <w:tcBorders>
+              <w:top w:val="single" w:color="BFC7D1" w:sz="4"/>
+              <w:left w:val="single" w:color="BFC7D1" w:sz="4"/>
+              <w:bottom w:val="single" w:color="BFC7D1" w:sz="4"/>
+              <w:right w:val="single" w:color="BFC7D1" w:sz="4"/>
+            </w:tcBorders>
+            <w:tcMar>
+              <w:top w:type="dxa" w:w="60"/>
+              <w:left w:type="dxa" w:w="90"/>
+              <w:bottom w:type="dxa" w:w="60"/>
+              <w:right w:type="dxa" w:w="90"/>
+            </w:tcMar>
+          </w:tcPr>
+          <w:p>
+            <w:pPr>
+              <w:spacing w:after="0" w:line="252"/>
+            </w:pPr>
+            <w:r>
+              <w:rPr>
+                <w:sz w:val="18"/>
+                <w:szCs w:val="18"/>
+              </w:rPr>
+              <w:t xml:space="preserve">check the data folder is writable by the web user</w:t>
+            </w:r>
+          </w:p>
+        </w:tc>
+      </w:tr>
+      <w:tr>
+        <w:trPr>
+          <w:cantSplit/>
+          <w:tblHeader w:val="false"/>
+        </w:trPr>
+        <w:tc>
+          <w:tcPr>
+            <w:tcW w:type="dxa" w:w="2321"/>
+            <w:tcBorders>
+              <w:top w:val="single" w:color="BFC7D1" w:sz="4"/>
+              <w:left w:val="single" w:color="BFC7D1" w:sz="4"/>
+              <w:bottom w:val="single" w:color="BFC7D1" w:sz="4"/>
+              <w:right w:val="single" w:color="BFC7D1" w:sz="4"/>
+            </w:tcBorders>
+            <w:tcMar>
+              <w:top w:type="dxa" w:w="60"/>
+              <w:left w:type="dxa" w:w="90"/>
+              <w:bottom w:type="dxa" w:w="60"/>
+              <w:right w:type="dxa" w:w="90"/>
+            </w:tcMar>
+          </w:tcPr>
+          <w:p>
+            <w:pPr>
+              <w:spacing w:after="0" w:line="252"/>
+            </w:pPr>
+            <w:r>
+              <w:rPr>
+                <w:sz w:val="18"/>
+                <w:szCs w:val="18"/>
+              </w:rPr>
+              <w:t xml:space="preserve">migrations</w:t>
+            </w:r>
+          </w:p>
+        </w:tc>
+        <w:tc>
+          <w:tcPr>
+            <w:tcW w:type="dxa" w:w="2546"/>
+            <w:tcBorders>
+              <w:top w:val="single" w:color="BFC7D1" w:sz="4"/>
+              <w:left w:val="single" w:color="BFC7D1" w:sz="4"/>
+              <w:bottom w:val="single" w:color="BFC7D1" w:sz="4"/>
+              <w:right w:val="single" w:color="BFC7D1" w:sz="4"/>
+            </w:tcBorders>
+            <w:tcMar>
+              <w:top w:type="dxa" w:w="60"/>
+              <w:left w:type="dxa" w:w="90"/>
+              <w:bottom w:type="dxa" w:w="60"/>
+              <w:right w:type="dxa" w:w="90"/>
+            </w:tcMar>
+          </w:tcPr>
+          <w:p>
+            <w:pPr>
+              <w:spacing w:after="0" w:line="252"/>
+            </w:pPr>
+            <w:r>
+              <w:rPr>
+                <w:sz w:val="18"/>
+                <w:szCs w:val="18"/>
+              </w:rPr>
+              <w:t xml:space="preserve">every schema update is applied</w:t>
+            </w:r>
+          </w:p>
+        </w:tc>
+        <w:tc>
+          <w:tcPr>
+            <w:tcW w:type="dxa" w:w="4493"/>
+            <w:tcBorders>
+              <w:top w:val="single" w:color="BFC7D1" w:sz="4"/>
+              <w:left w:val="single" w:color="BFC7D1" w:sz="4"/>
+              <w:bottom w:val="single" w:color="BFC7D1" w:sz="4"/>
+              <w:right w:val="single" w:color="BFC7D1" w:sz="4"/>
+            </w:tcBorders>
+            <w:tcMar>
+              <w:top w:type="dxa" w:w="60"/>
+              <w:left w:type="dxa" w:w="90"/>
+              <w:bottom w:type="dxa" w:w="60"/>
+              <w:right w:type="dxa" w:w="90"/>
+            </w:tcMar>
+          </w:tcPr>
+          <w:p>
+            <w:pPr>
+              <w:spacing w:after="0" w:line="252"/>
+            </w:pPr>
+            <w:r>
+              <w:rPr>
+                <w:sz w:val="18"/>
+                <w:szCs w:val="18"/>
+              </w:rPr>
+              <w:t xml:space="preserve">restart the server from the status page</w:t>
+            </w:r>
+          </w:p>
+        </w:tc>
+      </w:tr>
+      <w:tr>
+        <w:trPr>
+          <w:cantSplit/>
+          <w:tblHeader w:val="false"/>
+        </w:trPr>
+        <w:tc>
+          <w:tcPr>
+            <w:tcW w:type="dxa" w:w="2321"/>
+            <w:tcBorders>
+              <w:top w:val="single" w:color="BFC7D1" w:sz="4"/>
+              <w:left w:val="single" w:color="BFC7D1" w:sz="4"/>
+              <w:bottom w:val="single" w:color="BFC7D1" w:sz="4"/>
+              <w:right w:val="single" w:color="BFC7D1" w:sz="4"/>
+            </w:tcBorders>
+            <w:tcMar>
+              <w:top w:type="dxa" w:w="60"/>
+              <w:left w:type="dxa" w:w="90"/>
+              <w:bottom w:type="dxa" w:w="60"/>
+              <w:right w:type="dxa" w:w="90"/>
+            </w:tcMar>
+          </w:tcPr>
+          <w:p>
+            <w:pPr>
+              <w:spacing w:after="0" w:line="252"/>
+            </w:pPr>
+            <w:r>
+              <w:rPr>
+                <w:sz w:val="18"/>
+                <w:szCs w:val="18"/>
+              </w:rPr>
+              <w:t xml:space="preserve">media (public), media (private)</w:t>
+            </w:r>
+          </w:p>
+        </w:tc>
+        <w:tc>
+          <w:tcPr>
+            <w:tcW w:type="dxa" w:w="2546"/>
+            <w:tcBorders>
+              <w:top w:val="single" w:color="BFC7D1" w:sz="4"/>
+              <w:left w:val="single" w:color="BFC7D1" w:sz="4"/>
+              <w:bottom w:val="single" w:color="BFC7D1" w:sz="4"/>
+              <w:right w:val="single" w:color="BFC7D1" w:sz="4"/>
+            </w:tcBorders>
+            <w:tcMar>
+              <w:top w:type="dxa" w:w="60"/>
+              <w:left w:type="dxa" w:w="90"/>
+              <w:bottom w:type="dxa" w:w="60"/>
+              <w:right w:type="dxa" w:w="90"/>
+            </w:tcMar>
+          </w:tcPr>
+          <w:p>
+            <w:pPr>
+              <w:spacing w:after="0" w:line="252"/>
+            </w:pPr>
+            <w:r>
+              <w:rPr>
+                <w:sz w:val="18"/>
+                <w:szCs w:val="18"/>
+              </w:rPr>
+              <w:t xml:space="preserve">the media folders are writable</w:t>
+            </w:r>
+          </w:p>
+        </w:tc>
+        <w:tc>
+          <w:tcPr>
+            <w:tcW w:type="dxa" w:w="4493"/>
+            <w:tcBorders>
+              <w:top w:val="single" w:color="BFC7D1" w:sz="4"/>
+              <w:left w:val="single" w:color="BFC7D1" w:sz="4"/>
+              <w:bottom w:val="single" w:color="BFC7D1" w:sz="4"/>
+              <w:right w:val="single" w:color="BFC7D1" w:sz="4"/>
+            </w:tcBorders>
+            <w:tcMar>
+              <w:top w:type="dxa" w:w="60"/>
+              <w:left w:type="dxa" w:w="90"/>
+              <w:bottom w:type="dxa" w:w="60"/>
+              <w:right w:type="dxa" w:w="90"/>
+            </w:tcMar>
+          </w:tcPr>
+          <w:p>
+            <w:pPr>
+              <w:spacing w:after="0" w:line="252"/>
+            </w:pPr>
+            <w:r>
+              <w:rPr>
+                <w:sz w:val="18"/>
+                <w:szCs w:val="18"/>
+              </w:rPr>
+              <w:t xml:space="preserve">fix ownership of the data folder</w:t>
+            </w:r>
+          </w:p>
+        </w:tc>
+      </w:tr>
+      <w:tr>
+        <w:trPr>
+          <w:cantSplit/>
+          <w:tblHeader w:val="false"/>
+        </w:trPr>
+        <w:tc>
+          <w:tcPr>
+            <w:tcW w:type="dxa" w:w="2321"/>
+            <w:tcBorders>
+              <w:top w:val="single" w:color="BFC7D1" w:sz="4"/>
+              <w:left w:val="single" w:color="BFC7D1" w:sz="4"/>
+              <w:bottom w:val="single" w:color="BFC7D1" w:sz="4"/>
+              <w:right w:val="single" w:color="BFC7D1" w:sz="4"/>
+            </w:tcBorders>
+            <w:tcMar>
+              <w:top w:type="dxa" w:w="60"/>
+              <w:left w:type="dxa" w:w="90"/>
+              <w:bottom w:type="dxa" w:w="60"/>
+              <w:right w:type="dxa" w:w="90"/>
+            </w:tcMar>
+          </w:tcPr>
+          <w:p>
+            <w:pPr>
+              <w:spacing w:after="0" w:line="252"/>
+            </w:pPr>
+            <w:r>
+              <w:rPr>
+                <w:sz w:val="18"/>
+                <w:szCs w:val="18"/>
+              </w:rPr>
+              <w:t xml:space="preserve">ffmpeg</w:t>
+            </w:r>
+          </w:p>
+        </w:tc>
+        <w:tc>
+          <w:tcPr>
+            <w:tcW w:type="dxa" w:w="2546"/>
+            <w:tcBorders>
+              <w:top w:val="single" w:color="BFC7D1" w:sz="4"/>
+              <w:left w:val="single" w:color="BFC7D1" w:sz="4"/>
+              <w:bottom w:val="single" w:color="BFC7D1" w:sz="4"/>
+              <w:right w:val="single" w:color="BFC7D1" w:sz="4"/>
+            </w:tcBorders>
+            <w:tcMar>
+              <w:top w:type="dxa" w:w="60"/>
+              <w:left w:type="dxa" w:w="90"/>
+              <w:bottom w:type="dxa" w:w="60"/>
+              <w:right w:type="dxa" w:w="90"/>
+            </w:tcMar>
+          </w:tcPr>
+          <w:p>
+            <w:pPr>
+              <w:spacing w:after="0" w:line="252"/>
+            </w:pPr>
+            <w:r>
+              <w:rPr>
+                <w:sz w:val="18"/>
+                <w:szCs w:val="18"/>
+              </w:rPr>
+              <w:t xml:space="preserve">ffmpeg is installed on the machine</w:t>
+            </w:r>
+          </w:p>
+        </w:tc>
+        <w:tc>
+          <w:tcPr>
+            <w:tcW w:type="dxa" w:w="4493"/>
+            <w:tcBorders>
+              <w:top w:val="single" w:color="BFC7D1" w:sz="4"/>
+              <w:left w:val="single" w:color="BFC7D1" w:sz="4"/>
+              <w:bottom w:val="single" w:color="BFC7D1" w:sz="4"/>
+              <w:right w:val="single" w:color="BFC7D1" w:sz="4"/>
+            </w:tcBorders>
+            <w:tcMar>
+              <w:top w:type="dxa" w:w="60"/>
+              <w:left w:type="dxa" w:w="90"/>
+              <w:bottom w:type="dxa" w:w="60"/>
+              <w:right w:type="dxa" w:w="90"/>
+            </w:tcMar>
+          </w:tcPr>
+          <w:p>
+            <w:pPr>
+              <w:spacing w:after="0" w:line="252"/>
+            </w:pPr>
+            <w:r>
+              <w:rPr>
+                <w:sz w:val="18"/>
+                <w:szCs w:val="18"/>
+              </w:rPr>
+              <w:t xml:space="preserve">install it; until then video thumbnails, transcoding and Level 3 watermarking are off</w:t>
+            </w:r>
+          </w:p>
+        </w:tc>
+      </w:tr>
+      <w:tr>
+        <w:trPr>
+          <w:cantSplit/>
+          <w:tblHeader w:val="false"/>
+        </w:trPr>
+        <w:tc>
+          <w:tcPr>
+            <w:tcW w:type="dxa" w:w="2321"/>
+            <w:tcBorders>
+              <w:top w:val="single" w:color="BFC7D1" w:sz="4"/>
+              <w:left w:val="single" w:color="BFC7D1" w:sz="4"/>
+              <w:bottom w:val="single" w:color="BFC7D1" w:sz="4"/>
+              <w:right w:val="single" w:color="BFC7D1" w:sz="4"/>
+            </w:tcBorders>
+            <w:tcMar>
+              <w:top w:type="dxa" w:w="60"/>
+              <w:left w:type="dxa" w:w="90"/>
+              <w:bottom w:type="dxa" w:w="60"/>
+              <w:right w:type="dxa" w:w="90"/>
+            </w:tcMar>
+          </w:tcPr>
+          <w:p>
+            <w:pPr>
+              <w:spacing w:after="0" w:line="252"/>
+            </w:pPr>
+            <w:r>
+              <w:rPr>
+                <w:sz w:val="18"/>
+                <w:szCs w:val="18"/>
+              </w:rPr>
+              <w:t xml:space="preserve">public url</w:t>
+            </w:r>
+          </w:p>
+        </w:tc>
+        <w:tc>
+          <w:tcPr>
+            <w:tcW w:type="dxa" w:w="2546"/>
+            <w:tcBorders>
+              <w:top w:val="single" w:color="BFC7D1" w:sz="4"/>
+              <w:left w:val="single" w:color="BFC7D1" w:sz="4"/>
+              <w:bottom w:val="single" w:color="BFC7D1" w:sz="4"/>
+              <w:right w:val="single" w:color="BFC7D1" w:sz="4"/>
+            </w:tcBorders>
+            <w:tcMar>
+              <w:top w:type="dxa" w:w="60"/>
+              <w:left w:type="dxa" w:w="90"/>
+              <w:bottom w:type="dxa" w:w="60"/>
+              <w:right w:type="dxa" w:w="90"/>
+            </w:tcMar>
+          </w:tcPr>
+          <w:p>
+            <w:pPr>
+              <w:spacing w:after="0" w:line="252"/>
+            </w:pPr>
+            <w:r>
+              <w:rPr>
+                <w:sz w:val="18"/>
+                <w:szCs w:val="18"/>
+              </w:rPr>
+              <w:t xml:space="preserve">the site uses HTTPS</w:t>
+            </w:r>
+          </w:p>
+        </w:tc>
+        <w:tc>
+          <w:tcPr>
+            <w:tcW w:type="dxa" w:w="4493"/>
+            <w:tcBorders>
+              <w:top w:val="single" w:color="BFC7D1" w:sz="4"/>
+              <w:left w:val="single" w:color="BFC7D1" w:sz="4"/>
+              <w:bottom w:val="single" w:color="BFC7D1" w:sz="4"/>
+              <w:right w:val="single" w:color="BFC7D1" w:sz="4"/>
+            </w:tcBorders>
+            <w:tcMar>
+              <w:top w:type="dxa" w:w="60"/>
+              <w:left w:type="dxa" w:w="90"/>
+              <w:bottom w:type="dxa" w:w="60"/>
+              <w:right w:type="dxa" w:w="90"/>
+            </w:tcMar>
+          </w:tcPr>
+          <w:p>
+            <w:pPr>
+              <w:spacing w:after="0" w:line="252"/>
+            </w:pPr>
+            <w:r>
+              <w:rPr>
+                <w:sz w:val="18"/>
+                <w:szCs w:val="18"/>
+              </w:rPr>
+              <w:t xml:space="preserve">enable HTTPS on the site</w:t>
+            </w:r>
+          </w:p>
+        </w:tc>
+      </w:tr>
+    </w:tbl>
+    <w:p>
+      <w:pPr>
+        <w:spacing w:after="120"/>
+      </w:pPr>
+    </w:p>
+    <w:p>
+      <w:pPr>
+        <w:pStyle w:val="Heading1"/>
+        <w:keepNext/>
+        <w:pageBreakBefore/>
+        <w:spacing w:after="120" w:before="360"/>
+      </w:pPr>
+      <w:r>
+        <w:t xml:space="preserve">8. The store on your website</w:t>
       </w:r>
     </w:p>
     <w:p>
@@ -1637,25 +2271,7 @@
         <w:spacing w:after="120" w:line="276"/>
       </w:pPr>
       <w:r>
-        <w:rPr>
-          <w:b/>
-          <w:bCs/>
-        </w:rPr>
-        <w:t xml:space="preserve">On WordPress</w:t>
-      </w:r>
-      <w:r>
-        <w:t xml:space="preserve">, place </w:t>
-      </w:r>
-      <w:r>
-        <w:rPr>
-          <w:rFonts w:ascii="Consolas" w:cs="Consolas" w:eastAsia="Consolas" w:hAnsi="Consolas"/>
-          <w:sz w:val="19"/>
-          <w:szCs w:val="19"/>
-        </w:rPr>
-        <w:t xml:space="preserve">[mms_showcase view="grid"]</w:t>
-      </w:r>
-      <w:r>
-        <w:t xml:space="preserve"> in a Shortcode block on any page.</w:t>
+        <w:t xml:space="preserve">The showcase is the store front. It lists published products with a type badge, title, description and price, and offers two layouts.</w:t>
       </w:r>
     </w:p>
     <w:p>
@@ -1724,43 +2340,7 @@
           <w:sz w:val="18"/>
           <w:szCs w:val="18"/>
         </w:rPr>
-        <w:t xml:space="preserve">A WordPress page with the showcase (mock-up page, live store content)</w:t>
-      </w:r>
-    </w:p>
-    <w:p>
-      <w:pPr>
-        <w:spacing w:after="120" w:line="276"/>
-      </w:pPr>
-      <w:r>
-        <w:rPr>
-          <w:b/>
-          <w:bCs/>
-        </w:rPr>
-        <w:t xml:space="preserve">On Joomla</w:t>
-      </w:r>
-      <w:r>
-        <w:t xml:space="preserve">, type </w:t>
-      </w:r>
-      <w:r>
-        <w:rPr>
-          <w:rFonts w:ascii="Consolas" w:cs="Consolas" w:eastAsia="Consolas" w:hAnsi="Consolas"/>
-          <w:sz w:val="19"/>
-          <w:szCs w:val="19"/>
-        </w:rPr>
-        <w:t xml:space="preserve">{mms_showcase view=grid}</w:t>
-      </w:r>
-      <w:r>
-        <w:t xml:space="preserve"> in an article, or add the </w:t>
-      </w:r>
-      <w:r>
-        <w:rPr>
-          <w:i/>
-          <w:iCs/>
-        </w:rPr>
-        <w:t xml:space="preserve">MediaMarketplace Embed</w:t>
-      </w:r>
-      <w:r>
-        <w:t xml:space="preserve"> module to a position.</w:t>
+        <w:t xml:space="preserve">The showcase in grid view</w:t>
       </w:r>
     </w:p>
     <w:p>
@@ -1829,6 +2409,206 @@
           <w:sz w:val="18"/>
           <w:szCs w:val="18"/>
         </w:rPr>
+        <w:t xml:space="preserve">The showcase in list view</w:t>
+      </w:r>
+    </w:p>
+    <w:p>
+      <w:pPr>
+        <w:spacing w:after="120" w:line="276"/>
+      </w:pPr>
+      <w:r>
+        <w:rPr>
+          <w:b/>
+          <w:bCs/>
+        </w:rPr>
+        <w:t xml:space="preserve">On WordPress</w:t>
+      </w:r>
+      <w:r>
+        <w:t xml:space="preserve">, place </w:t>
+      </w:r>
+      <w:r>
+        <w:rPr>
+          <w:rFonts w:ascii="Consolas" w:cs="Consolas" w:eastAsia="Consolas" w:hAnsi="Consolas"/>
+          <w:sz w:val="19"/>
+          <w:szCs w:val="19"/>
+        </w:rPr>
+        <w:t xml:space="preserve">[mms_showcase view="grid"]</w:t>
+      </w:r>
+      <w:r>
+        <w:t xml:space="preserve"> in a Shortcode block on any page.</w:t>
+      </w:r>
+    </w:p>
+    <w:p>
+      <w:pPr>
+        <w:keepNext/>
+        <w:pBdr>
+          <w:top w:val="single" w:color="BFC7D1" w:sz="4"/>
+          <w:left w:val="single" w:color="BFC7D1" w:sz="4"/>
+          <w:bottom w:val="single" w:color="BFC7D1" w:sz="4"/>
+          <w:right w:val="single" w:color="BFC7D1" w:sz="4"/>
+        </w:pBdr>
+        <w:spacing w:after="60" w:before="120"/>
+        <w:jc w:val="center"/>
+      </w:pPr>
+      <w:r>
+        <w:drawing>
+          <wp:inline distT="0" distB="0" distL="0" distR="0">
+            <wp:extent cx="5943600" cy="3714750"/>
+            <wp:effectExtent t="0" r="0" b="0" l="0"/>
+            <wp:docPr id="1" name="" descr="" title=""/>
+            <wp:cNvGraphicFramePr>
+              <a:graphicFrameLocks xmlns:a="http://schemas.openxmlformats.org/drawingml/2006/main" noChangeAspect="1"/>
+            </wp:cNvGraphicFramePr>
+            <a:graphic xmlns:a="http://schemas.openxmlformats.org/drawingml/2006/main">
+              <a:graphicData uri="http://schemas.openxmlformats.org/drawingml/2006/picture">
+                <pic:pic xmlns:pic="http://schemas.openxmlformats.org/drawingml/2006/picture">
+                  <pic:nvPicPr>
+                    <pic:cNvPr id="0" name="" descr=""/>
+                    <pic:cNvPicPr>
+                      <a:picLocks noChangeAspect="1" noChangeArrowheads="1"/>
+                    </pic:cNvPicPr>
+                  </pic:nvPicPr>
+                  <pic:blipFill>
+                    <a:blip r:embed="rId18" cstate="none"/>
+                    <a:srcRect/>
+                    <a:stretch>
+                      <a:fillRect/>
+                    </a:stretch>
+                  </pic:blipFill>
+                  <pic:spPr bwMode="auto">
+                    <a:xfrm>
+                      <a:off x="0" y="0"/>
+                      <a:ext cx="5943600" cy="3714750"/>
+                    </a:xfrm>
+                    <a:prstGeom prst="rect">
+                      <a:avLst/>
+                    </a:prstGeom>
+                  </pic:spPr>
+                </pic:pic>
+              </a:graphicData>
+            </a:graphic>
+          </wp:inline>
+        </w:drawing>
+      </w:r>
+    </w:p>
+    <w:p>
+      <w:pPr>
+        <w:spacing w:after="200"/>
+        <w:jc w:val="center"/>
+      </w:pPr>
+      <w:r>
+        <w:rPr>
+          <w:i/>
+          <w:iCs/>
+          <w:color w:val="5B6470"/>
+          <w:sz w:val="18"/>
+          <w:szCs w:val="18"/>
+        </w:rPr>
+        <w:t xml:space="preserve">A WordPress page with the showcase (mock-up page, live store content)</w:t>
+      </w:r>
+    </w:p>
+    <w:p>
+      <w:pPr>
+        <w:spacing w:after="120" w:line="276"/>
+      </w:pPr>
+      <w:r>
+        <w:rPr>
+          <w:b/>
+          <w:bCs/>
+        </w:rPr>
+        <w:t xml:space="preserve">On Joomla</w:t>
+      </w:r>
+      <w:r>
+        <w:t xml:space="preserve">, type </w:t>
+      </w:r>
+      <w:r>
+        <w:rPr>
+          <w:rFonts w:ascii="Consolas" w:cs="Consolas" w:eastAsia="Consolas" w:hAnsi="Consolas"/>
+          <w:sz w:val="19"/>
+          <w:szCs w:val="19"/>
+        </w:rPr>
+        <w:t xml:space="preserve">{mms_showcase view=grid}</w:t>
+      </w:r>
+      <w:r>
+        <w:t xml:space="preserve"> in an article, or add the </w:t>
+      </w:r>
+      <w:r>
+        <w:rPr>
+          <w:i/>
+          <w:iCs/>
+        </w:rPr>
+        <w:t xml:space="preserve">MediaMarketplace Embed</w:t>
+      </w:r>
+      <w:r>
+        <w:t xml:space="preserve"> module to a position.</w:t>
+      </w:r>
+    </w:p>
+    <w:p>
+      <w:pPr>
+        <w:keepNext/>
+        <w:pBdr>
+          <w:top w:val="single" w:color="BFC7D1" w:sz="4"/>
+          <w:left w:val="single" w:color="BFC7D1" w:sz="4"/>
+          <w:bottom w:val="single" w:color="BFC7D1" w:sz="4"/>
+          <w:right w:val="single" w:color="BFC7D1" w:sz="4"/>
+        </w:pBdr>
+        <w:spacing w:after="60" w:before="120"/>
+        <w:jc w:val="center"/>
+      </w:pPr>
+      <w:r>
+        <w:drawing>
+          <wp:inline distT="0" distB="0" distL="0" distR="0">
+            <wp:extent cx="5943600" cy="3714750"/>
+            <wp:effectExtent t="0" r="0" b="0" l="0"/>
+            <wp:docPr id="1" name="" descr="" title=""/>
+            <wp:cNvGraphicFramePr>
+              <a:graphicFrameLocks xmlns:a="http://schemas.openxmlformats.org/drawingml/2006/main" noChangeAspect="1"/>
+            </wp:cNvGraphicFramePr>
+            <a:graphic xmlns:a="http://schemas.openxmlformats.org/drawingml/2006/main">
+              <a:graphicData uri="http://schemas.openxmlformats.org/drawingml/2006/picture">
+                <pic:pic xmlns:pic="http://schemas.openxmlformats.org/drawingml/2006/picture">
+                  <pic:nvPicPr>
+                    <pic:cNvPr id="0" name="" descr=""/>
+                    <pic:cNvPicPr>
+                      <a:picLocks noChangeAspect="1" noChangeArrowheads="1"/>
+                    </pic:cNvPicPr>
+                  </pic:nvPicPr>
+                  <pic:blipFill>
+                    <a:blip r:embed="rId19" cstate="none"/>
+                    <a:srcRect/>
+                    <a:stretch>
+                      <a:fillRect/>
+                    </a:stretch>
+                  </pic:blipFill>
+                  <pic:spPr bwMode="auto">
+                    <a:xfrm>
+                      <a:off x="0" y="0"/>
+                      <a:ext cx="5943600" cy="3714750"/>
+                    </a:xfrm>
+                    <a:prstGeom prst="rect">
+                      <a:avLst/>
+                    </a:prstGeom>
+                  </pic:spPr>
+                </pic:pic>
+              </a:graphicData>
+            </a:graphic>
+          </wp:inline>
+        </w:drawing>
+      </w:r>
+    </w:p>
+    <w:p>
+      <w:pPr>
+        <w:spacing w:after="200"/>
+        <w:jc w:val="center"/>
+      </w:pPr>
+      <w:r>
+        <w:rPr>
+          <w:i/>
+          <w:iCs/>
+          <w:color w:val="5B6470"/>
+          <w:sz w:val="18"/>
+          <w:szCs w:val="18"/>
+        </w:rPr>
         <w:t xml:space="preserve">A Joomla page with the showcase in the article and a featured list in the sidebar (mock-up page, live store content)</w:t>
       </w:r>
     </w:p>
@@ -1848,7 +2628,7 @@
         <w:spacing w:after="120" w:before="360"/>
       </w:pPr>
       <w:r>
-        <w:t xml:space="preserve">8. Member sign-on</w:t>
+        <w:t xml:space="preserve">9. Member sign-in</w:t>
       </w:r>
     </w:p>
     <w:p>
@@ -1856,7 +2636,7 @@
         <w:spacing w:after="120" w:line="276"/>
       </w:pPr>
       <w:r>
-        <w:t xml:space="preserve">Your website's logged-in members do not need a second password. The bridge adds a </w:t>
+        <w:t xml:space="preserve">Your website's logged-in members do not need a second password. Add a </w:t>
       </w:r>
       <w:r>
         <w:rPr>
@@ -1866,7 +2646,7 @@
         <w:t xml:space="preserve">My media</w:t>
       </w:r>
       <w:r>
-        <w:t xml:space="preserve"> link (</w:t>
+        <w:t xml:space="preserve"> link with </w:t>
       </w:r>
       <w:r>
         <w:rPr>
@@ -1877,7 +2657,7 @@
         <w:t xml:space="preserve">[mms_signin]</w:t>
       </w:r>
       <w:r>
-        <w:t xml:space="preserve"> on WordPress, </w:t>
+        <w:t xml:space="preserve"> (WordPress) or </w:t>
       </w:r>
       <w:r>
         <w:rPr>
@@ -1888,7 +2668,7 @@
         <w:t xml:space="preserve">{mms_signin}</w:t>
       </w:r>
       <w:r>
-        <w:t xml:space="preserve"> on Joomla). Clicking it sends the member to the server with a signed, five-minute token. The server recognises the member, creates a customer account on first visit, and opens their account page.</w:t>
+        <w:t xml:space="preserve"> (Joomla). Clicking it opens the member's store account: purchases, downloads, passes, receipts. A member who signs in for the first time gets a customer account automatically, matched by email.</w:t>
       </w:r>
     </w:p>
     <w:p>
@@ -1896,15 +2676,7 @@
         <w:spacing w:after="120" w:line="276"/>
       </w:pPr>
       <w:r>
-        <w:t xml:space="preserve">Behind the scenes: the token is signed with the site's secret, so only your website can produce it; the server checks the signature, the expiry and that the token came from the right kind of site.</w:t>
-      </w:r>
-    </w:p>
-    <w:p>
-      <w:pPr>
-        <w:spacing w:after="120" w:line="276"/>
-      </w:pPr>
-      <w:r>
-        <w:t xml:space="preserve">People who are not members of your website can still buy: the server has its own sign-in and registration for customers.</w:t>
+        <w:t xml:space="preserve">People who are not members of your website can still buy: the store has its own sign-in and registration for customers.</w:t>
       </w:r>
     </w:p>
     <w:p>
@@ -1915,7 +2687,7 @@
         <w:spacing w:after="120" w:before="360"/>
       </w:pPr>
       <w:r>
-        <w:t xml:space="preserve">9. Products (preview of the next release)</w:t>
+        <w:t xml:space="preserve">10. Products (preview of the next release)</w:t>
       </w:r>
     </w:p>
     <w:p>
@@ -2662,31 +3434,32 @@
     </w:p>
     <w:p>
       <w:pPr>
-        <w:spacing w:after="120" w:line="276"/>
-      </w:pPr>
-      <w:r>
-        <w:t xml:space="preserve">Until then, products can be created by an administrator through the database or the API, and they appear in the showcase as soon as their status is </w:t>
-      </w:r>
-      <w:r>
-        <w:rPr>
-          <w:i/>
-          <w:iCs/>
-        </w:rPr>
-        <w:t xml:space="preserve">published</w:t>
-      </w:r>
-      <w:r>
-        <w:t xml:space="preserve">.</w:t>
-      </w:r>
-    </w:p>
-    <w:p>
-      <w:pPr>
         <w:pStyle w:val="Heading1"/>
         <w:keepNext/>
         <w:pageBreakBefore/>
         <w:spacing w:after="120" w:before="360"/>
       </w:pPr>
       <w:r>
-        <w:t xml:space="preserve">10. Roadmap</w:t>
+        <w:t xml:space="preserve">11. Backups and data</w:t>
+      </w:r>
+    </w:p>
+    <w:p>
+      <w:pPr>
+        <w:spacing w:after="120" w:line="276"/>
+      </w:pPr>
+      <w:r>
+        <w:t xml:space="preserve">Everything the store owns lives in one data folder on the server (see the installation guide for its location): the database, the media files, the configuration and the log. Back that folder up with your site. The package adds nothing to the WordPress or Joomla database.</w:t>
+      </w:r>
+    </w:p>
+    <w:p>
+      <w:pPr>
+        <w:pStyle w:val="Heading1"/>
+        <w:keepNext/>
+        <w:pageBreakBefore/>
+        <w:spacing w:after="120" w:before="360"/>
+      </w:pPr>
+      <w:r>
+        <w:t xml:space="preserve">12. Roadmap</w:t>
       </w:r>
     </w:p>
     <w:tbl>
@@ -2916,7 +3689,7 @@
                 <w:sz w:val="18"/>
                 <w:szCs w:val="18"/>
               </w:rPr>
-              <w:t xml:space="preserve">widget builder with 35 templates, 12 site templates, exports for WordPress and Joomla</w:t>
+              <w:t xml:space="preserve">widget builder with 35 templates, 12 site templates, Gutenberg blocks and Joomla menu items</w:t>
             </w:r>
           </w:p>
         </w:tc>
@@ -3108,7 +3881,7 @@
                 <w:sz w:val="18"/>
                 <w:szCs w:val="18"/>
               </w:rPr>
-              <w:t xml:space="preserve">Square and Authorize.net, multi-currency, commercial players, Google Business Profile with AI assistance</w:t>
+              <w:t xml:space="preserve">Square and Authorize.net, multi-currency, commercial players, Google Business Profile with AI assistance, ARM build</w:t>
             </w:r>
           </w:p>
         </w:tc>
@@ -3127,7 +3900,7 @@
         <w:spacing w:after="120" w:before="360"/>
       </w:pPr>
       <w:r>
-        <w:t xml:space="preserve">11. Glossary</w:t>
+        <w:t xml:space="preserve">13. Glossary</w:t>
       </w:r>
     </w:p>
     <w:p>
@@ -3144,10 +3917,10 @@
           <w:b/>
           <w:bCs/>
         </w:rPr>
-        <w:t xml:space="preserve">Bridge</w:t>
-      </w:r>
-      <w:r>
-        <w:t xml:space="preserve"> — the WordPress plugin or Joomla package that shows the store and signs members in.</w:t>
+        <w:t xml:space="preserve">Package</w:t>
+      </w:r>
+      <w:r>
+        <w:t xml:space="preserve"> — the WordPress plugin or Joomla package you install; it contains the store server.</w:t>
       </w:r>
     </w:p>
     <w:p>
@@ -3164,10 +3937,10 @@
           <w:b/>
           <w:bCs/>
         </w:rPr>
-        <w:t xml:space="preserve">Bridge site</w:t>
-      </w:r>
-      <w:r>
-        <w:t xml:space="preserve"> — a website registered on the server with an origin and a secret.</w:t>
+        <w:t xml:space="preserve">Store server</w:t>
+      </w:r>
+      <w:r>
+        <w:t xml:space="preserve"> — the background program the package runs on your server; you use it through the store admin.</w:t>
       </w:r>
     </w:p>
     <w:p>
@@ -3184,10 +3957,21 @@
           <w:b/>
           <w:bCs/>
         </w:rPr>
-        <w:t xml:space="preserve">Embed</w:t>
-      </w:r>
-      <w:r>
-        <w:t xml:space="preserve"> — a store area delivered by the server inside one of your pages.</w:t>
+        <w:t xml:space="preserve">Store admin</w:t>
+      </w:r>
+      <w:r>
+        <w:t xml:space="preserve"> — the web admin at your site address followed by </w:t>
+      </w:r>
+      <w:r>
+        <w:rPr>
+          <w:rFonts w:ascii="Consolas" w:cs="Consolas" w:eastAsia="Consolas" w:hAnsi="Consolas"/>
+          <w:sz w:val="19"/>
+          <w:szCs w:val="19"/>
+        </w:rPr>
+        <w:t xml:space="preserve">/mms/admin</w:t>
+      </w:r>
+      <w:r>
+        <w:t xml:space="preserve">.</w:t>
       </w:r>
     </w:p>
     <w:p>
@@ -3204,21 +3988,10 @@
           <w:b/>
           <w:bCs/>
         </w:rPr>
-        <w:t xml:space="preserve">Origin</w:t>
-      </w:r>
-      <w:r>
-        <w:t xml:space="preserve"> — the scheme and host of a website, for example </w:t>
-      </w:r>
-      <w:r>
-        <w:rPr>
-          <w:rFonts w:ascii="Consolas" w:cs="Consolas" w:eastAsia="Consolas" w:hAnsi="Consolas"/>
-          <w:sz w:val="19"/>
-          <w:szCs w:val="19"/>
-        </w:rPr>
-        <w:t xml:space="preserve">https://www.example.com</w:t>
-      </w:r>
-      <w:r>
-        <w:t xml:space="preserve">.</w:t>
+        <w:t xml:space="preserve">Showcase</w:t>
+      </w:r>
+      <w:r>
+        <w:t xml:space="preserve"> — the product listing placed in pages.</w:t>
       </w:r>
     </w:p>
     <w:p>
@@ -3235,10 +4008,10 @@
           <w:b/>
           <w:bCs/>
         </w:rPr>
-        <w:t xml:space="preserve">Showcase</w:t>
-      </w:r>
-      <w:r>
-        <w:t xml:space="preserve"> — the product listing.</w:t>
+        <w:t xml:space="preserve">Entitlement</w:t>
+      </w:r>
+      <w:r>
+        <w:t xml:space="preserve"> — a record that a customer may access a product, page or the whole library for a period.</w:t>
       </w:r>
     </w:p>
     <w:p>
@@ -3255,10 +4028,10 @@
           <w:b/>
           <w:bCs/>
         </w:rPr>
-        <w:t xml:space="preserve">Entitlement</w:t>
-      </w:r>
-      <w:r>
-        <w:t xml:space="preserve"> — a record that a customer may access a product, page or the whole library for a period.</w:t>
+        <w:t xml:space="preserve">Site pass</w:t>
+      </w:r>
+      <w:r>
+        <w:t xml:space="preserve"> — an entitlement that covers the whole library.</w:t>
       </w:r>
     </w:p>
     <w:p>
@@ -3275,30 +4048,10 @@
           <w:b/>
           <w:bCs/>
         </w:rPr>
-        <w:t xml:space="preserve">Site pass</w:t>
-      </w:r>
-      <w:r>
-        <w:t xml:space="preserve"> — an entitlement that covers the whole library.</w:t>
-      </w:r>
-    </w:p>
-    <w:p>
-      <w:pPr>
-        <w:pStyle w:val="ListParagraph"/>
-        <w:numPr>
-          <w:ilvl w:val="0"/>
-          <w:numId w:val="2"/>
-        </w:numPr>
-        <w:spacing w:after="60" w:line="276"/>
-      </w:pPr>
-      <w:r>
-        <w:rPr>
-          <w:b/>
-          <w:bCs/>
-        </w:rPr>
-        <w:t xml:space="preserve">Audit log</w:t>
-      </w:r>
-      <w:r>
-        <w:t xml:space="preserve"> — the record of administrative and access events shown on the dashboard.</w:t>
+        <w:t xml:space="preserve">Data folder</w:t>
+      </w:r>
+      <w:r>
+        <w:t xml:space="preserve"> — where the store keeps its database, media and configuration.</w:t>
       </w:r>
     </w:p>
     <w:sectPr>

</xml_diff>